<commit_message>
still working exercise 7 logic
</commit_message>
<xml_diff>
--- a/Fall-2025/logic-for-cs/exercise-set-7.docx
+++ b/Fall-2025/logic-for-cs/exercise-set-7.docx
@@ -441,9 +441,6 @@
               <w:pStyle w:val="ListParagraph"/>
               <w:ind w:left="0"/>
               <w:jc w:val="center"/>
-              <w:rPr>
-                <w:rFonts w:ascii="Cambria Math" w:hAnsi="Cambria Math" w:cs="Cambria Math"/>
-              </w:rPr>
             </w:pPr>
           </w:p>
         </w:tc>
@@ -495,9 +492,6 @@
               <w:pStyle w:val="ListParagraph"/>
               <w:ind w:left="0"/>
               <w:jc w:val="center"/>
-              <w:rPr>
-                <w:rFonts w:ascii="Cambria Math" w:hAnsi="Cambria Math" w:cs="Cambria Math"/>
-              </w:rPr>
             </w:pPr>
           </w:p>
         </w:tc>
@@ -513,10 +507,7 @@
               <w:jc w:val="center"/>
             </w:pPr>
             <w:r>
-              <w:t>¬</w:t>
-            </w:r>
-            <w:r>
-              <w:t>D(x)</w:t>
+              <w:t>¬D(x)</w:t>
             </w:r>
           </w:p>
         </w:tc>
@@ -552,9 +543,6 @@
               <w:pStyle w:val="ListParagraph"/>
               <w:ind w:left="0"/>
               <w:jc w:val="center"/>
-              <w:rPr>
-                <w:rFonts w:ascii="Cambria Math" w:hAnsi="Cambria Math" w:cs="Cambria Math"/>
-              </w:rPr>
             </w:pPr>
           </w:p>
         </w:tc>
@@ -570,19 +558,7 @@
               <w:jc w:val="center"/>
             </w:pPr>
             <w:r>
-              <w:t xml:space="preserve">H(x) </w:t>
-            </w:r>
-            <w:r>
-              <w:t>→</w:t>
-            </w:r>
-            <w:r>
-              <w:t xml:space="preserve"> </w:t>
-            </w:r>
-            <w:r>
-              <w:t>¬</w:t>
-            </w:r>
-            <w:r>
-              <w:t>D(x)</w:t>
+              <w:t>H(x) → ¬D(x)</w:t>
             </w:r>
           </w:p>
         </w:tc>
@@ -618,9 +594,6 @@
               <w:pStyle w:val="ListParagraph"/>
               <w:ind w:left="0"/>
               <w:jc w:val="center"/>
-              <w:rPr>
-                <w:rFonts w:ascii="Cambria Math" w:hAnsi="Cambria Math" w:cs="Cambria Math"/>
-              </w:rPr>
             </w:pPr>
           </w:p>
         </w:tc>
@@ -873,10 +846,7 @@
               <w:t>∨</w:t>
             </w:r>
             <w:r>
-              <w:t xml:space="preserve"> D(x</w:t>
-            </w:r>
-            <w:r>
-              <w:t>)</w:t>
+              <w:t xml:space="preserve"> D(x)</w:t>
             </w:r>
           </w:p>
         </w:tc>
@@ -1042,19 +1012,17 @@
               </w:rPr>
               <w:t>∀</w:t>
             </w:r>
-            <w:proofErr w:type="spellStart"/>
-            <w:r>
-              <w:rPr>
-                <w:rFonts w:ascii="Cambria Math" w:hAnsi="Cambria Math" w:cs="Cambria Math"/>
-              </w:rPr>
-              <w:t>x∀y</w:t>
-            </w:r>
-            <w:proofErr w:type="spellEnd"/>
-            <w:r>
-              <w:rPr>
-                <w:rFonts w:ascii="Cambria Math" w:hAnsi="Cambria Math" w:cs="Cambria Math"/>
-              </w:rPr>
-              <w:t>(O(x, y) → R(x, y))</w:t>
+            <w:r>
+              <w:t>x</w:t>
+            </w:r>
+            <w:r>
+              <w:rPr>
+                <w:rFonts w:ascii="Cambria Math" w:hAnsi="Cambria Math" w:cs="Cambria Math"/>
+              </w:rPr>
+              <w:t>∀</w:t>
+            </w:r>
+            <w:r>
+              <w:t>y(O(x, y) → R(x, y))</w:t>
             </w:r>
           </w:p>
         </w:tc>
@@ -1103,9 +1071,6 @@
               <w:pStyle w:val="ListParagraph"/>
               <w:ind w:left="0"/>
               <w:jc w:val="center"/>
-              <w:rPr>
-                <w:rFonts w:ascii="Cambria Math" w:hAnsi="Cambria Math" w:cs="Cambria Math"/>
-              </w:rPr>
             </w:pPr>
           </w:p>
         </w:tc>
@@ -1154,9 +1119,6 @@
               <w:pStyle w:val="ListParagraph"/>
               <w:ind w:left="0"/>
               <w:jc w:val="center"/>
-              <w:rPr>
-                <w:rFonts w:ascii="Cambria Math" w:hAnsi="Cambria Math" w:cs="Cambria Math"/>
-              </w:rPr>
             </w:pPr>
           </w:p>
         </w:tc>
@@ -1172,9 +1134,6 @@
               <w:jc w:val="center"/>
             </w:pPr>
             <w:r>
-              <w:rPr>
-                <w:rFonts w:ascii="Cambria Math" w:hAnsi="Cambria Math" w:cs="Cambria Math"/>
-              </w:rPr>
               <w:t>O(x, y) → R(x, y))</w:t>
             </w:r>
           </w:p>
@@ -1208,9 +1167,6 @@
               <w:pStyle w:val="ListParagraph"/>
               <w:ind w:left="0"/>
               <w:jc w:val="center"/>
-              <w:rPr>
-                <w:rFonts w:ascii="Cambria Math" w:hAnsi="Cambria Math" w:cs="Cambria Math"/>
-              </w:rPr>
             </w:pPr>
           </w:p>
         </w:tc>
@@ -1224,15 +1180,15 @@
               <w:pStyle w:val="ListParagraph"/>
               <w:ind w:left="0"/>
               <w:jc w:val="center"/>
-              <w:rPr>
-                <w:rFonts w:ascii="Cambria Math" w:hAnsi="Cambria Math" w:cs="Cambria Math"/>
-              </w:rPr>
-            </w:pPr>
-            <w:r>
-              <w:rPr>
-                <w:rFonts w:ascii="Cambria Math" w:hAnsi="Cambria Math" w:cs="Cambria Math"/>
-              </w:rPr>
-              <w:t>∀y(O(x, y) → R(x, y))</w:t>
+            </w:pPr>
+            <w:r>
+              <w:rPr>
+                <w:rFonts w:ascii="Cambria Math" w:hAnsi="Cambria Math" w:cs="Cambria Math"/>
+              </w:rPr>
+              <w:t>∀</w:t>
+            </w:r>
+            <w:r>
+              <w:t>y(O(x, y) → R(x, y))</w:t>
             </w:r>
           </w:p>
         </w:tc>
@@ -1268,9 +1224,6 @@
               <w:pStyle w:val="ListParagraph"/>
               <w:ind w:left="0"/>
               <w:jc w:val="center"/>
-              <w:rPr>
-                <w:rFonts w:ascii="Cambria Math" w:hAnsi="Cambria Math" w:cs="Cambria Math"/>
-              </w:rPr>
             </w:pPr>
           </w:p>
         </w:tc>
@@ -1291,19 +1244,17 @@
               </w:rPr>
               <w:t>∀</w:t>
             </w:r>
-            <w:proofErr w:type="spellStart"/>
-            <w:r>
-              <w:rPr>
-                <w:rFonts w:ascii="Cambria Math" w:hAnsi="Cambria Math" w:cs="Cambria Math"/>
-              </w:rPr>
-              <w:t>x∀y</w:t>
-            </w:r>
-            <w:proofErr w:type="spellEnd"/>
-            <w:r>
-              <w:rPr>
-                <w:rFonts w:ascii="Cambria Math" w:hAnsi="Cambria Math" w:cs="Cambria Math"/>
-              </w:rPr>
-              <w:t>(O(x, y) → R(x, y))</w:t>
+            <w:r>
+              <w:t>x</w:t>
+            </w:r>
+            <w:r>
+              <w:rPr>
+                <w:rFonts w:ascii="Cambria Math" w:hAnsi="Cambria Math" w:cs="Cambria Math"/>
+              </w:rPr>
+              <w:t>∀</w:t>
+            </w:r>
+            <w:r>
+              <w:t>y(O(x, y) → R(x, y))</w:t>
             </w:r>
           </w:p>
         </w:tc>
@@ -1443,19 +1394,17 @@
               </w:rPr>
               <w:t>∀</w:t>
             </w:r>
-            <w:proofErr w:type="spellStart"/>
-            <w:r>
-              <w:rPr>
-                <w:rFonts w:ascii="Cambria Math" w:hAnsi="Cambria Math" w:cs="Cambria Math"/>
-              </w:rPr>
-              <w:t>x∀y</w:t>
-            </w:r>
-            <w:proofErr w:type="spellEnd"/>
-            <w:r>
-              <w:rPr>
-                <w:rFonts w:ascii="Cambria Math" w:hAnsi="Cambria Math" w:cs="Cambria Math"/>
-              </w:rPr>
-              <w:t>(x + y = y + x)</w:t>
+            <w:r>
+              <w:t>x</w:t>
+            </w:r>
+            <w:r>
+              <w:rPr>
+                <w:rFonts w:ascii="Cambria Math" w:hAnsi="Cambria Math" w:cs="Cambria Math"/>
+              </w:rPr>
+              <w:t>∀</w:t>
+            </w:r>
+            <w:r>
+              <w:t>y(x + y = y + x)</w:t>
             </w:r>
           </w:p>
         </w:tc>
@@ -1507,28 +1456,28 @@
               <w:pStyle w:val="ListParagraph"/>
               <w:ind w:left="0"/>
               <w:jc w:val="center"/>
-              <w:rPr>
-                <w:rFonts w:ascii="Cambria Math" w:hAnsi="Cambria Math" w:cs="Cambria Math"/>
-              </w:rPr>
-            </w:pPr>
-          </w:p>
-        </w:tc>
-        <w:tc>
-          <w:tcPr>
-            <w:tcW w:w="2882" w:type="dxa"/>
-            <w:vAlign w:val="center"/>
-          </w:tcPr>
-          <w:p>
-            <w:pPr>
-              <w:pStyle w:val="ListParagraph"/>
-              <w:ind w:left="0"/>
-              <w:jc w:val="center"/>
-            </w:pPr>
-            <w:r>
-              <w:rPr>
-                <w:rFonts w:ascii="Cambria Math" w:hAnsi="Cambria Math" w:cs="Cambria Math"/>
-              </w:rPr>
-              <w:t>∀y(x + y = y + x)</w:t>
+            </w:pPr>
+          </w:p>
+        </w:tc>
+        <w:tc>
+          <w:tcPr>
+            <w:tcW w:w="2882" w:type="dxa"/>
+            <w:vAlign w:val="center"/>
+          </w:tcPr>
+          <w:p>
+            <w:pPr>
+              <w:pStyle w:val="ListParagraph"/>
+              <w:ind w:left="0"/>
+              <w:jc w:val="center"/>
+            </w:pPr>
+            <w:r>
+              <w:rPr>
+                <w:rFonts w:ascii="Cambria Math" w:hAnsi="Cambria Math" w:cs="Cambria Math"/>
+              </w:rPr>
+              <w:t>∀</w:t>
+            </w:r>
+            <w:r>
+              <w:t>y(x + y = y + x)</w:t>
             </w:r>
           </w:p>
         </w:tc>
@@ -1564,9 +1513,6 @@
               <w:pStyle w:val="ListParagraph"/>
               <w:ind w:left="0"/>
               <w:jc w:val="center"/>
-              <w:rPr>
-                <w:rFonts w:ascii="Cambria Math" w:hAnsi="Cambria Math" w:cs="Cambria Math"/>
-              </w:rPr>
             </w:pPr>
           </w:p>
         </w:tc>
@@ -1587,19 +1533,17 @@
               </w:rPr>
               <w:t>∀</w:t>
             </w:r>
-            <w:proofErr w:type="spellStart"/>
-            <w:r>
-              <w:rPr>
-                <w:rFonts w:ascii="Cambria Math" w:hAnsi="Cambria Math" w:cs="Cambria Math"/>
-              </w:rPr>
-              <w:t>x∀y</w:t>
-            </w:r>
-            <w:proofErr w:type="spellEnd"/>
-            <w:r>
-              <w:rPr>
-                <w:rFonts w:ascii="Cambria Math" w:hAnsi="Cambria Math" w:cs="Cambria Math"/>
-              </w:rPr>
-              <w:t>(x + y = y + x)</w:t>
+            <w:r>
+              <w:t>x</w:t>
+            </w:r>
+            <w:r>
+              <w:rPr>
+                <w:rFonts w:ascii="Cambria Math" w:hAnsi="Cambria Math" w:cs="Cambria Math"/>
+              </w:rPr>
+              <w:t>∀</w:t>
+            </w:r>
+            <w:r>
+              <w:t>y(x + y = y + x)</w:t>
             </w:r>
           </w:p>
         </w:tc>
@@ -1640,14 +1584,53 @@
               <w:rPr>
                 <w:rFonts w:ascii="Cambria Math" w:hAnsi="Cambria Math" w:cs="Cambria Math"/>
               </w:rPr>
-              <w:t xml:space="preserve">∀x(prime(x) ↔ ¬∃n(n ∈ N ∧ n &gt; 1 ∧ </w:t>
+              <w:t>∀</w:t>
+            </w:r>
+            <w:r>
+              <w:t>x(prime(x) ↔ ¬</w:t>
+            </w:r>
+            <w:r>
+              <w:rPr>
+                <w:rFonts w:ascii="Cambria Math" w:hAnsi="Cambria Math" w:cs="Cambria Math"/>
+              </w:rPr>
+              <w:t>∃</w:t>
+            </w:r>
+            <w:r>
+              <w:t xml:space="preserve">n(n </w:t>
+            </w:r>
+            <w:r>
+              <w:rPr>
+                <w:rFonts w:ascii="Cambria Math" w:hAnsi="Cambria Math" w:cs="Cambria Math"/>
+              </w:rPr>
+              <w:t>∈</w:t>
+            </w:r>
+            <w:r>
+              <w:t xml:space="preserve"> N </w:t>
+            </w:r>
+            <w:r>
+              <w:rPr>
+                <w:rFonts w:ascii="Cambria Math" w:hAnsi="Cambria Math" w:cs="Cambria Math"/>
+              </w:rPr>
+              <w:t>∧</w:t>
+            </w:r>
+            <w:r>
+              <w:t xml:space="preserve"> n &gt; 1 </w:t>
+            </w:r>
+            <w:r>
+              <w:rPr>
+                <w:rFonts w:ascii="Cambria Math" w:hAnsi="Cambria Math" w:cs="Cambria Math"/>
+              </w:rPr>
+              <w:t>∧</w:t>
+            </w:r>
+            <w:r>
+              <w:t xml:space="preserve"> </w:t>
             </w:r>
             <m:oMath>
               <m:f>
                 <m:fPr>
                   <m:ctrlPr>
                     <w:rPr>
-                      <w:rFonts w:ascii="Cambria Math" w:hAnsi="Cambria Math" w:cs="Cambria Math"/>
+                      <w:rFonts w:ascii="Cambria Math" w:hAnsi="Cambria Math"/>
                       <w:i/>
                     </w:rPr>
                   </m:ctrlPr>
@@ -1655,7 +1638,7 @@
                 <m:num>
                   <m:r>
                     <w:rPr>
-                      <w:rFonts w:ascii="Cambria Math" w:hAnsi="Cambria Math" w:cs="Cambria Math"/>
+                      <w:rFonts w:ascii="Cambria Math" w:hAnsi="Cambria Math"/>
                     </w:rPr>
                     <m:t>x</m:t>
                   </m:r>
@@ -1663,7 +1646,7 @@
                 <m:den>
                   <m:r>
                     <w:rPr>
-                      <w:rFonts w:ascii="Cambria Math" w:hAnsi="Cambria Math" w:cs="Cambria Math"/>
+                      <w:rFonts w:ascii="Cambria Math" w:hAnsi="Cambria Math"/>
                     </w:rPr>
                     <m:t>n</m:t>
                   </m:r>
@@ -1671,10 +1654,16 @@
               </m:f>
             </m:oMath>
             <w:r>
-              <w:rPr>
-                <w:rFonts w:ascii="Cambria Math" w:hAnsi="Cambria Math" w:cs="Cambria Math"/>
-              </w:rPr>
-              <w:t xml:space="preserve"> ∈ N))</w:t>
+              <w:t xml:space="preserve"> </w:t>
+            </w:r>
+            <w:r>
+              <w:rPr>
+                <w:rFonts w:ascii="Cambria Math" w:hAnsi="Cambria Math" w:cs="Cambria Math"/>
+              </w:rPr>
+              <w:t>∈</w:t>
+            </w:r>
+            <w:r>
+              <w:t xml:space="preserve"> N))</w:t>
             </w:r>
           </w:p>
         </w:tc>
@@ -1747,7 +1736,10 @@
               <w:rPr>
                 <w:rFonts w:ascii="Cambria Math" w:hAnsi="Cambria Math" w:cs="Cambria Math"/>
               </w:rPr>
-              <w:t>∈ N</w:t>
+              <w:t>∈</w:t>
+            </w:r>
+            <w:r>
+              <w:t xml:space="preserve"> N</w:t>
             </w:r>
           </w:p>
         </w:tc>
@@ -1798,9 +1790,6 @@
               <w:jc w:val="center"/>
             </w:pPr>
             <w:r>
-              <w:rPr>
-                <w:rFonts w:ascii="Cambria Math" w:hAnsi="Cambria Math" w:cs="Cambria Math"/>
-              </w:rPr>
               <w:t>n &gt; 1</w:t>
             </w:r>
           </w:p>
@@ -1856,7 +1845,7 @@
                 <m:fPr>
                   <m:ctrlPr>
                     <w:rPr>
-                      <w:rFonts w:ascii="Cambria Math" w:hAnsi="Cambria Math" w:cs="Cambria Math"/>
+                      <w:rFonts w:ascii="Cambria Math" w:hAnsi="Cambria Math"/>
                       <w:i/>
                     </w:rPr>
                   </m:ctrlPr>
@@ -1864,7 +1853,7 @@
                 <m:num>
                   <m:r>
                     <w:rPr>
-                      <w:rFonts w:ascii="Cambria Math" w:hAnsi="Cambria Math" w:cs="Cambria Math"/>
+                      <w:rFonts w:ascii="Cambria Math" w:hAnsi="Cambria Math"/>
                     </w:rPr>
                     <m:t>x</m:t>
                   </m:r>
@@ -1872,7 +1861,7 @@
                 <m:den>
                   <m:r>
                     <w:rPr>
-                      <w:rFonts w:ascii="Cambria Math" w:hAnsi="Cambria Math" w:cs="Cambria Math"/>
+                      <w:rFonts w:ascii="Cambria Math" w:hAnsi="Cambria Math"/>
                     </w:rPr>
                     <m:t>n</m:t>
                   </m:r>
@@ -1880,10 +1869,16 @@
               </m:f>
             </m:oMath>
             <w:r>
-              <w:rPr>
-                <w:rFonts w:ascii="Cambria Math" w:hAnsi="Cambria Math" w:cs="Cambria Math"/>
-              </w:rPr>
-              <w:t xml:space="preserve"> ∈ N</w:t>
+              <w:t xml:space="preserve"> </w:t>
+            </w:r>
+            <w:r>
+              <w:rPr>
+                <w:rFonts w:ascii="Cambria Math" w:hAnsi="Cambria Math" w:cs="Cambria Math"/>
+              </w:rPr>
+              <w:t>∈</w:t>
+            </w:r>
+            <w:r>
+              <w:t xml:space="preserve"> N</w:t>
             </w:r>
           </w:p>
         </w:tc>
@@ -2003,17 +1998,41 @@
               <w:jc w:val="center"/>
             </w:pPr>
             <w:r>
-              <w:rPr>
-                <w:rFonts w:ascii="Cambria Math" w:hAnsi="Cambria Math" w:cs="Cambria Math"/>
-              </w:rPr>
-              <w:t xml:space="preserve">n ∈ N ∧ n &gt; 1 ∧ </w:t>
+              <w:t xml:space="preserve">n </w:t>
+            </w:r>
+            <w:r>
+              <w:rPr>
+                <w:rFonts w:ascii="Cambria Math" w:hAnsi="Cambria Math" w:cs="Cambria Math"/>
+              </w:rPr>
+              <w:t>∈</w:t>
+            </w:r>
+            <w:r>
+              <w:t xml:space="preserve"> N </w:t>
+            </w:r>
+            <w:r>
+              <w:rPr>
+                <w:rFonts w:ascii="Cambria Math" w:hAnsi="Cambria Math" w:cs="Cambria Math"/>
+              </w:rPr>
+              <w:t>∧</w:t>
+            </w:r>
+            <w:r>
+              <w:t xml:space="preserve"> n &gt; 1 </w:t>
+            </w:r>
+            <w:r>
+              <w:rPr>
+                <w:rFonts w:ascii="Cambria Math" w:hAnsi="Cambria Math" w:cs="Cambria Math"/>
+              </w:rPr>
+              <w:t>∧</w:t>
+            </w:r>
+            <w:r>
+              <w:t xml:space="preserve"> </w:t>
             </w:r>
             <m:oMath>
               <m:f>
                 <m:fPr>
                   <m:ctrlPr>
                     <w:rPr>
-                      <w:rFonts w:ascii="Cambria Math" w:hAnsi="Cambria Math" w:cs="Cambria Math"/>
+                      <w:rFonts w:ascii="Cambria Math" w:hAnsi="Cambria Math"/>
                       <w:i/>
                     </w:rPr>
                   </m:ctrlPr>
@@ -2021,7 +2040,7 @@
                 <m:num>
                   <m:r>
                     <w:rPr>
-                      <w:rFonts w:ascii="Cambria Math" w:hAnsi="Cambria Math" w:cs="Cambria Math"/>
+                      <w:rFonts w:ascii="Cambria Math" w:hAnsi="Cambria Math"/>
                     </w:rPr>
                     <m:t>x</m:t>
                   </m:r>
@@ -2029,7 +2048,7 @@
                 <m:den>
                   <m:r>
                     <w:rPr>
-                      <w:rFonts w:ascii="Cambria Math" w:hAnsi="Cambria Math" w:cs="Cambria Math"/>
+                      <w:rFonts w:ascii="Cambria Math" w:hAnsi="Cambria Math"/>
                     </w:rPr>
                     <m:t>n</m:t>
                   </m:r>
@@ -2037,10 +2056,16 @@
               </m:f>
             </m:oMath>
             <w:r>
-              <w:rPr>
-                <w:rFonts w:ascii="Cambria Math" w:hAnsi="Cambria Math" w:cs="Cambria Math"/>
-              </w:rPr>
-              <w:t xml:space="preserve"> ∈ N</w:t>
+              <w:t xml:space="preserve"> </w:t>
+            </w:r>
+            <w:r>
+              <w:rPr>
+                <w:rFonts w:ascii="Cambria Math" w:hAnsi="Cambria Math" w:cs="Cambria Math"/>
+              </w:rPr>
+              <w:t>∈</w:t>
+            </w:r>
+            <w:r>
+              <w:t xml:space="preserve"> N</w:t>
             </w:r>
           </w:p>
         </w:tc>
@@ -2094,14 +2119,44 @@
               <w:rPr>
                 <w:rFonts w:ascii="Cambria Math" w:hAnsi="Cambria Math" w:cs="Cambria Math"/>
               </w:rPr>
-              <w:t xml:space="preserve">∃n(n ∈ N ∧ n &gt; 1 ∧ </w:t>
+              <w:t>∃</w:t>
+            </w:r>
+            <w:r>
+              <w:t xml:space="preserve">n(n </w:t>
+            </w:r>
+            <w:r>
+              <w:rPr>
+                <w:rFonts w:ascii="Cambria Math" w:hAnsi="Cambria Math" w:cs="Cambria Math"/>
+              </w:rPr>
+              <w:t>∈</w:t>
+            </w:r>
+            <w:r>
+              <w:t xml:space="preserve"> N </w:t>
+            </w:r>
+            <w:r>
+              <w:rPr>
+                <w:rFonts w:ascii="Cambria Math" w:hAnsi="Cambria Math" w:cs="Cambria Math"/>
+              </w:rPr>
+              <w:t>∧</w:t>
+            </w:r>
+            <w:r>
+              <w:t xml:space="preserve"> n &gt; 1 </w:t>
+            </w:r>
+            <w:r>
+              <w:rPr>
+                <w:rFonts w:ascii="Cambria Math" w:hAnsi="Cambria Math" w:cs="Cambria Math"/>
+              </w:rPr>
+              <w:t>∧</w:t>
+            </w:r>
+            <w:r>
+              <w:t xml:space="preserve"> </w:t>
             </w:r>
             <m:oMath>
               <m:f>
                 <m:fPr>
                   <m:ctrlPr>
                     <w:rPr>
-                      <w:rFonts w:ascii="Cambria Math" w:hAnsi="Cambria Math" w:cs="Cambria Math"/>
+                      <w:rFonts w:ascii="Cambria Math" w:hAnsi="Cambria Math"/>
                       <w:i/>
                     </w:rPr>
                   </m:ctrlPr>
@@ -2109,7 +2164,7 @@
                 <m:num>
                   <m:r>
                     <w:rPr>
-                      <w:rFonts w:ascii="Cambria Math" w:hAnsi="Cambria Math" w:cs="Cambria Math"/>
+                      <w:rFonts w:ascii="Cambria Math" w:hAnsi="Cambria Math"/>
                     </w:rPr>
                     <m:t>x</m:t>
                   </m:r>
@@ -2117,7 +2172,7 @@
                 <m:den>
                   <m:r>
                     <w:rPr>
-                      <w:rFonts w:ascii="Cambria Math" w:hAnsi="Cambria Math" w:cs="Cambria Math"/>
+                      <w:rFonts w:ascii="Cambria Math" w:hAnsi="Cambria Math"/>
                     </w:rPr>
                     <m:t>n</m:t>
                   </m:r>
@@ -2125,10 +2180,16 @@
               </m:f>
             </m:oMath>
             <w:r>
-              <w:rPr>
-                <w:rFonts w:ascii="Cambria Math" w:hAnsi="Cambria Math" w:cs="Cambria Math"/>
-              </w:rPr>
-              <w:t xml:space="preserve"> ∈ N)</w:t>
+              <w:t xml:space="preserve"> </w:t>
+            </w:r>
+            <w:r>
+              <w:rPr>
+                <w:rFonts w:ascii="Cambria Math" w:hAnsi="Cambria Math" w:cs="Cambria Math"/>
+              </w:rPr>
+              <w:t>∈</w:t>
+            </w:r>
+            <w:r>
+              <w:t xml:space="preserve"> N)</w:t>
             </w:r>
           </w:p>
         </w:tc>
@@ -2179,17 +2240,50 @@
               <w:jc w:val="center"/>
             </w:pPr>
             <w:r>
-              <w:rPr>
-                <w:rFonts w:ascii="Cambria Math" w:hAnsi="Cambria Math" w:cs="Cambria Math"/>
-              </w:rPr>
-              <w:t xml:space="preserve">¬∃n(n ∈ N ∧ n &gt; 1 ∧ </w:t>
+              <w:t>¬</w:t>
+            </w:r>
+            <w:r>
+              <w:rPr>
+                <w:rFonts w:ascii="Cambria Math" w:hAnsi="Cambria Math" w:cs="Cambria Math"/>
+              </w:rPr>
+              <w:t>∃</w:t>
+            </w:r>
+            <w:r>
+              <w:t xml:space="preserve">n(n </w:t>
+            </w:r>
+            <w:r>
+              <w:rPr>
+                <w:rFonts w:ascii="Cambria Math" w:hAnsi="Cambria Math" w:cs="Cambria Math"/>
+              </w:rPr>
+              <w:t>∈</w:t>
+            </w:r>
+            <w:r>
+              <w:t xml:space="preserve"> N </w:t>
+            </w:r>
+            <w:r>
+              <w:rPr>
+                <w:rFonts w:ascii="Cambria Math" w:hAnsi="Cambria Math" w:cs="Cambria Math"/>
+              </w:rPr>
+              <w:t>∧</w:t>
+            </w:r>
+            <w:r>
+              <w:t xml:space="preserve"> n &gt; 1 </w:t>
+            </w:r>
+            <w:r>
+              <w:rPr>
+                <w:rFonts w:ascii="Cambria Math" w:hAnsi="Cambria Math" w:cs="Cambria Math"/>
+              </w:rPr>
+              <w:t>∧</w:t>
+            </w:r>
+            <w:r>
+              <w:t xml:space="preserve"> </w:t>
             </w:r>
             <m:oMath>
               <m:f>
                 <m:fPr>
                   <m:ctrlPr>
                     <w:rPr>
-                      <w:rFonts w:ascii="Cambria Math" w:hAnsi="Cambria Math" w:cs="Cambria Math"/>
+                      <w:rFonts w:ascii="Cambria Math" w:hAnsi="Cambria Math"/>
                       <w:i/>
                     </w:rPr>
                   </m:ctrlPr>
@@ -2197,7 +2291,7 @@
                 <m:num>
                   <m:r>
                     <w:rPr>
-                      <w:rFonts w:ascii="Cambria Math" w:hAnsi="Cambria Math" w:cs="Cambria Math"/>
+                      <w:rFonts w:ascii="Cambria Math" w:hAnsi="Cambria Math"/>
                     </w:rPr>
                     <m:t>x</m:t>
                   </m:r>
@@ -2205,7 +2299,7 @@
                 <m:den>
                   <m:r>
                     <w:rPr>
-                      <w:rFonts w:ascii="Cambria Math" w:hAnsi="Cambria Math" w:cs="Cambria Math"/>
+                      <w:rFonts w:ascii="Cambria Math" w:hAnsi="Cambria Math"/>
                     </w:rPr>
                     <m:t>n</m:t>
                   </m:r>
@@ -2213,10 +2307,16 @@
               </m:f>
             </m:oMath>
             <w:r>
-              <w:rPr>
-                <w:rFonts w:ascii="Cambria Math" w:hAnsi="Cambria Math" w:cs="Cambria Math"/>
-              </w:rPr>
-              <w:t xml:space="preserve"> ∈ N)</w:t>
+              <w:t xml:space="preserve"> </w:t>
+            </w:r>
+            <w:r>
+              <w:rPr>
+                <w:rFonts w:ascii="Cambria Math" w:hAnsi="Cambria Math" w:cs="Cambria Math"/>
+              </w:rPr>
+              <w:t>∈</w:t>
+            </w:r>
+            <w:r>
+              <w:t xml:space="preserve"> N)</w:t>
             </w:r>
           </w:p>
         </w:tc>
@@ -2267,17 +2367,50 @@
               <w:jc w:val="center"/>
             </w:pPr>
             <w:r>
-              <w:rPr>
-                <w:rFonts w:ascii="Cambria Math" w:hAnsi="Cambria Math" w:cs="Cambria Math"/>
-              </w:rPr>
-              <w:t xml:space="preserve">prime(x) ↔ ¬∃n(n ∈ N ∧ n &gt; 1 ∧ </w:t>
+              <w:t>prime(x) ↔ ¬</w:t>
+            </w:r>
+            <w:r>
+              <w:rPr>
+                <w:rFonts w:ascii="Cambria Math" w:hAnsi="Cambria Math" w:cs="Cambria Math"/>
+              </w:rPr>
+              <w:t>∃</w:t>
+            </w:r>
+            <w:r>
+              <w:t xml:space="preserve">n(n </w:t>
+            </w:r>
+            <w:r>
+              <w:rPr>
+                <w:rFonts w:ascii="Cambria Math" w:hAnsi="Cambria Math" w:cs="Cambria Math"/>
+              </w:rPr>
+              <w:t>∈</w:t>
+            </w:r>
+            <w:r>
+              <w:t xml:space="preserve"> N </w:t>
+            </w:r>
+            <w:r>
+              <w:rPr>
+                <w:rFonts w:ascii="Cambria Math" w:hAnsi="Cambria Math" w:cs="Cambria Math"/>
+              </w:rPr>
+              <w:t>∧</w:t>
+            </w:r>
+            <w:r>
+              <w:t xml:space="preserve"> n &gt; 1 </w:t>
+            </w:r>
+            <w:r>
+              <w:rPr>
+                <w:rFonts w:ascii="Cambria Math" w:hAnsi="Cambria Math" w:cs="Cambria Math"/>
+              </w:rPr>
+              <w:t>∧</w:t>
+            </w:r>
+            <w:r>
+              <w:t xml:space="preserve"> </w:t>
             </w:r>
             <m:oMath>
               <m:f>
                 <m:fPr>
                   <m:ctrlPr>
                     <w:rPr>
-                      <w:rFonts w:ascii="Cambria Math" w:hAnsi="Cambria Math" w:cs="Cambria Math"/>
+                      <w:rFonts w:ascii="Cambria Math" w:hAnsi="Cambria Math"/>
                       <w:i/>
                     </w:rPr>
                   </m:ctrlPr>
@@ -2285,7 +2418,7 @@
                 <m:num>
                   <m:r>
                     <w:rPr>
-                      <w:rFonts w:ascii="Cambria Math" w:hAnsi="Cambria Math" w:cs="Cambria Math"/>
+                      <w:rFonts w:ascii="Cambria Math" w:hAnsi="Cambria Math"/>
                     </w:rPr>
                     <m:t>x</m:t>
                   </m:r>
@@ -2293,7 +2426,7 @@
                 <m:den>
                   <m:r>
                     <w:rPr>
-                      <w:rFonts w:ascii="Cambria Math" w:hAnsi="Cambria Math" w:cs="Cambria Math"/>
+                      <w:rFonts w:ascii="Cambria Math" w:hAnsi="Cambria Math"/>
                     </w:rPr>
                     <m:t>n</m:t>
                   </m:r>
@@ -2301,10 +2434,16 @@
               </m:f>
             </m:oMath>
             <w:r>
-              <w:rPr>
-                <w:rFonts w:ascii="Cambria Math" w:hAnsi="Cambria Math" w:cs="Cambria Math"/>
-              </w:rPr>
-              <w:t xml:space="preserve"> ∈ N)</w:t>
+              <w:t xml:space="preserve"> </w:t>
+            </w:r>
+            <w:r>
+              <w:rPr>
+                <w:rFonts w:ascii="Cambria Math" w:hAnsi="Cambria Math" w:cs="Cambria Math"/>
+              </w:rPr>
+              <w:t>∈</w:t>
+            </w:r>
+            <w:r>
+              <w:t xml:space="preserve"> N)</w:t>
             </w:r>
           </w:p>
         </w:tc>
@@ -2358,14 +2497,53 @@
               <w:rPr>
                 <w:rFonts w:ascii="Cambria Math" w:hAnsi="Cambria Math" w:cs="Cambria Math"/>
               </w:rPr>
-              <w:t xml:space="preserve">∀x(prime(x) ↔ ¬∃n(n ∈ N ∧ n &gt; 1 ∧ </w:t>
+              <w:t>∀</w:t>
+            </w:r>
+            <w:r>
+              <w:t>x(prime(x) ↔ ¬</w:t>
+            </w:r>
+            <w:r>
+              <w:rPr>
+                <w:rFonts w:ascii="Cambria Math" w:hAnsi="Cambria Math" w:cs="Cambria Math"/>
+              </w:rPr>
+              <w:t>∃</w:t>
+            </w:r>
+            <w:r>
+              <w:t xml:space="preserve">n(n </w:t>
+            </w:r>
+            <w:r>
+              <w:rPr>
+                <w:rFonts w:ascii="Cambria Math" w:hAnsi="Cambria Math" w:cs="Cambria Math"/>
+              </w:rPr>
+              <w:t>∈</w:t>
+            </w:r>
+            <w:r>
+              <w:t xml:space="preserve"> N </w:t>
+            </w:r>
+            <w:r>
+              <w:rPr>
+                <w:rFonts w:ascii="Cambria Math" w:hAnsi="Cambria Math" w:cs="Cambria Math"/>
+              </w:rPr>
+              <w:t>∧</w:t>
+            </w:r>
+            <w:r>
+              <w:t xml:space="preserve"> n &gt; 1 </w:t>
+            </w:r>
+            <w:r>
+              <w:rPr>
+                <w:rFonts w:ascii="Cambria Math" w:hAnsi="Cambria Math" w:cs="Cambria Math"/>
+              </w:rPr>
+              <w:t>∧</w:t>
+            </w:r>
+            <w:r>
+              <w:t xml:space="preserve"> </w:t>
             </w:r>
             <m:oMath>
               <m:f>
                 <m:fPr>
                   <m:ctrlPr>
                     <w:rPr>
-                      <w:rFonts w:ascii="Cambria Math" w:hAnsi="Cambria Math" w:cs="Cambria Math"/>
+                      <w:rFonts w:ascii="Cambria Math" w:hAnsi="Cambria Math"/>
                       <w:i/>
                     </w:rPr>
                   </m:ctrlPr>
@@ -2373,7 +2551,7 @@
                 <m:num>
                   <m:r>
                     <w:rPr>
-                      <w:rFonts w:ascii="Cambria Math" w:hAnsi="Cambria Math" w:cs="Cambria Math"/>
+                      <w:rFonts w:ascii="Cambria Math" w:hAnsi="Cambria Math"/>
                     </w:rPr>
                     <m:t>x</m:t>
                   </m:r>
@@ -2381,7 +2559,7 @@
                 <m:den>
                   <m:r>
                     <w:rPr>
-                      <w:rFonts w:ascii="Cambria Math" w:hAnsi="Cambria Math" w:cs="Cambria Math"/>
+                      <w:rFonts w:ascii="Cambria Math" w:hAnsi="Cambria Math"/>
                     </w:rPr>
                     <m:t>n</m:t>
                   </m:r>
@@ -2389,10 +2567,16 @@
               </m:f>
             </m:oMath>
             <w:r>
-              <w:rPr>
-                <w:rFonts w:ascii="Cambria Math" w:hAnsi="Cambria Math" w:cs="Cambria Math"/>
-              </w:rPr>
-              <w:t xml:space="preserve"> ∈ N))</w:t>
+              <w:t xml:space="preserve"> </w:t>
+            </w:r>
+            <w:r>
+              <w:rPr>
+                <w:rFonts w:ascii="Cambria Math" w:hAnsi="Cambria Math" w:cs="Cambria Math"/>
+              </w:rPr>
+              <w:t>∈</w:t>
+            </w:r>
+            <w:r>
+              <w:t xml:space="preserve"> N))</w:t>
             </w:r>
           </w:p>
         </w:tc>
@@ -2433,83 +2617,69 @@
               <w:lastRenderedPageBreak/>
               <w:t>∃</w:t>
             </w:r>
-            <w:proofErr w:type="spellStart"/>
-            <w:r>
-              <w:rPr>
-                <w:rFonts w:ascii="Cambria Math" w:hAnsi="Cambria Math" w:cs="Cambria Math"/>
-              </w:rPr>
-              <w:t>δ∃x</w:t>
-            </w:r>
-            <w:proofErr w:type="spellEnd"/>
-            <w:r>
-              <w:rPr>
-                <w:rFonts w:ascii="Cambria Math" w:hAnsi="Cambria Math" w:cs="Cambria Math"/>
-              </w:rPr>
-              <w:t>((2</w:t>
-            </w:r>
-            <w:r>
-              <w:rPr>
-                <w:rFonts w:ascii="Cambria Math" w:hAnsi="Cambria Math" w:cs="Cambria Math"/>
+            <w:r>
+              <w:t>δ</w:t>
+            </w:r>
+            <w:r>
+              <w:rPr>
+                <w:rFonts w:ascii="Cambria Math" w:hAnsi="Cambria Math" w:cs="Cambria Math"/>
+              </w:rPr>
+              <w:t>∃</w:t>
+            </w:r>
+            <w:r>
+              <w:t>x((2</w:t>
+            </w:r>
+            <w:r>
+              <w:rPr>
                 <w:vertAlign w:val="superscript"/>
               </w:rPr>
               <w:t>4</w:t>
             </w:r>
             <w:r>
-              <w:rPr>
-                <w:rFonts w:ascii="Cambria Math" w:hAnsi="Cambria Math" w:cs="Cambria Math"/>
-              </w:rPr>
-              <w:t xml:space="preserve"> ≠</w:t>
-            </w:r>
-            <w:r>
-              <w:rPr>
-                <w:rFonts w:ascii="Cambria Math" w:hAnsi="Cambria Math" w:cs="Cambria Math"/>
-              </w:rPr>
-              <w:t xml:space="preserve"> δ → &lt; (|38|, 75, 3)) → ∀φ(φ = a∨ &gt; (φ)))</w:t>
-            </w:r>
-          </w:p>
-        </w:tc>
-        <w:tc>
-          <w:tcPr>
-            <w:tcW w:w="2882" w:type="dxa"/>
-            <w:vAlign w:val="center"/>
-          </w:tcPr>
-          <w:p>
-            <w:pPr>
-              <w:pStyle w:val="ListParagraph"/>
-              <w:ind w:left="0"/>
-              <w:jc w:val="center"/>
-            </w:pPr>
-            <w:r>
-              <w:rPr>
-                <w:rFonts w:ascii="Cambria Math" w:hAnsi="Cambria Math" w:cs="Cambria Math"/>
-              </w:rPr>
+              <w:t xml:space="preserve"> ≠ δ → &lt; (|38|, 75, 3)) → </w:t>
+            </w:r>
+            <w:r>
+              <w:rPr>
+                <w:rFonts w:ascii="Cambria Math" w:hAnsi="Cambria Math" w:cs="Cambria Math"/>
+              </w:rPr>
+              <w:t>∀</w:t>
+            </w:r>
+            <w:r>
+              <w:t>φ(φ = a</w:t>
+            </w:r>
+            <w:r>
+              <w:rPr>
+                <w:rFonts w:ascii="Cambria Math" w:hAnsi="Cambria Math" w:cs="Cambria Math"/>
+              </w:rPr>
+              <w:t>∨</w:t>
+            </w:r>
+            <w:r>
+              <w:t xml:space="preserve"> &gt; (φ)))</w:t>
+            </w:r>
+          </w:p>
+        </w:tc>
+        <w:tc>
+          <w:tcPr>
+            <w:tcW w:w="2882" w:type="dxa"/>
+            <w:vAlign w:val="center"/>
+          </w:tcPr>
+          <w:p>
+            <w:pPr>
+              <w:pStyle w:val="ListParagraph"/>
+              <w:ind w:left="0"/>
+              <w:jc w:val="center"/>
+            </w:pPr>
+            <w:r>
               <w:t>2</w:t>
             </w:r>
             <w:r>
               <w:rPr>
-                <w:rFonts w:ascii="Cambria Math" w:hAnsi="Cambria Math" w:cs="Cambria Math"/>
                 <w:vertAlign w:val="superscript"/>
               </w:rPr>
-              <w:t>4</w:t>
-            </w:r>
-            <w:r>
-              <w:rPr>
-                <w:rFonts w:ascii="Cambria Math" w:hAnsi="Cambria Math" w:cs="Cambria Math"/>
-                <w:vertAlign w:val="superscript"/>
-              </w:rPr>
-              <w:t xml:space="preserve"> </w:t>
-            </w:r>
-            <w:r>
-              <w:rPr>
-                <w:rFonts w:ascii="Cambria Math" w:hAnsi="Cambria Math" w:cs="Cambria Math"/>
-              </w:rPr>
-              <w:t>≠</w:t>
-            </w:r>
-            <w:r>
-              <w:rPr>
-                <w:rFonts w:ascii="Cambria Math" w:hAnsi="Cambria Math" w:cs="Cambria Math"/>
-              </w:rPr>
-              <w:t xml:space="preserve"> δ</w:t>
+              <w:t xml:space="preserve">4 </w:t>
+            </w:r>
+            <w:r>
+              <w:t>≠ δ</w:t>
             </w:r>
           </w:p>
         </w:tc>
@@ -2542,27 +2712,21 @@
               <w:pStyle w:val="ListParagraph"/>
               <w:ind w:left="0"/>
               <w:jc w:val="center"/>
-              <w:rPr>
-                <w:rFonts w:ascii="Cambria Math" w:hAnsi="Cambria Math" w:cs="Cambria Math"/>
-              </w:rPr>
-            </w:pPr>
-          </w:p>
-        </w:tc>
-        <w:tc>
-          <w:tcPr>
-            <w:tcW w:w="2882" w:type="dxa"/>
-            <w:vAlign w:val="center"/>
-          </w:tcPr>
-          <w:p>
-            <w:pPr>
-              <w:pStyle w:val="ListParagraph"/>
-              <w:ind w:left="0"/>
-              <w:jc w:val="center"/>
-            </w:pPr>
-            <w:r>
-              <w:rPr>
-                <w:rFonts w:ascii="Cambria Math" w:hAnsi="Cambria Math" w:cs="Cambria Math"/>
-              </w:rPr>
+            </w:pPr>
+          </w:p>
+        </w:tc>
+        <w:tc>
+          <w:tcPr>
+            <w:tcW w:w="2882" w:type="dxa"/>
+            <w:vAlign w:val="center"/>
+          </w:tcPr>
+          <w:p>
+            <w:pPr>
+              <w:pStyle w:val="ListParagraph"/>
+              <w:ind w:left="0"/>
+              <w:jc w:val="center"/>
+            </w:pPr>
+            <w:r>
               <w:t>&lt; (|38|, 75, 3)</w:t>
             </w:r>
           </w:p>
@@ -2596,47 +2760,31 @@
               <w:pStyle w:val="ListParagraph"/>
               <w:ind w:left="0"/>
               <w:jc w:val="center"/>
-              <w:rPr>
-                <w:rFonts w:ascii="Cambria Math" w:hAnsi="Cambria Math" w:cs="Cambria Math"/>
-              </w:rPr>
-            </w:pPr>
-          </w:p>
-        </w:tc>
-        <w:tc>
-          <w:tcPr>
-            <w:tcW w:w="2882" w:type="dxa"/>
-            <w:vAlign w:val="center"/>
-          </w:tcPr>
-          <w:p>
-            <w:pPr>
-              <w:pStyle w:val="ListParagraph"/>
-              <w:ind w:left="0"/>
-              <w:jc w:val="center"/>
-            </w:pPr>
-            <w:r>
-              <w:rPr>
-                <w:rFonts w:ascii="Cambria Math" w:hAnsi="Cambria Math" w:cs="Cambria Math"/>
-              </w:rPr>
+            </w:pPr>
+          </w:p>
+        </w:tc>
+        <w:tc>
+          <w:tcPr>
+            <w:tcW w:w="2882" w:type="dxa"/>
+            <w:vAlign w:val="center"/>
+          </w:tcPr>
+          <w:p>
+            <w:pPr>
+              <w:pStyle w:val="ListParagraph"/>
+              <w:ind w:left="0"/>
+              <w:jc w:val="center"/>
+            </w:pPr>
+            <w:r>
               <w:t>2</w:t>
             </w:r>
             <w:r>
               <w:rPr>
-                <w:rFonts w:ascii="Cambria Math" w:hAnsi="Cambria Math" w:cs="Cambria Math"/>
                 <w:vertAlign w:val="superscript"/>
               </w:rPr>
               <w:t>4</w:t>
             </w:r>
             <w:r>
-              <w:rPr>
-                <w:rFonts w:ascii="Cambria Math" w:hAnsi="Cambria Math" w:cs="Cambria Math"/>
-              </w:rPr>
-              <w:t xml:space="preserve"> ≠</w:t>
-            </w:r>
-            <w:r>
-              <w:rPr>
-                <w:rFonts w:ascii="Cambria Math" w:hAnsi="Cambria Math" w:cs="Cambria Math"/>
-              </w:rPr>
-              <w:t xml:space="preserve"> δ → &lt; (|38|, 75, 3)</w:t>
+              <w:t xml:space="preserve"> ≠ δ → &lt; (|38|, 75, 3)</w:t>
             </w:r>
           </w:p>
         </w:tc>
@@ -2672,31 +2820,28 @@
               <w:pStyle w:val="ListParagraph"/>
               <w:ind w:left="0"/>
               <w:jc w:val="center"/>
-              <w:rPr>
-                <w:rFonts w:ascii="Cambria Math" w:hAnsi="Cambria Math" w:cs="Cambria Math"/>
-              </w:rPr>
-            </w:pPr>
-          </w:p>
-        </w:tc>
-        <w:tc>
-          <w:tcPr>
-            <w:tcW w:w="2882" w:type="dxa"/>
-            <w:vAlign w:val="center"/>
-          </w:tcPr>
-          <w:p>
-            <w:pPr>
-              <w:pStyle w:val="ListParagraph"/>
-              <w:ind w:left="0"/>
-              <w:jc w:val="center"/>
-              <w:rPr>
-                <w:rFonts w:ascii="Cambria Math" w:hAnsi="Cambria Math" w:cs="Cambria Math"/>
-              </w:rPr>
-            </w:pPr>
-            <w:r>
-              <w:rPr>
-                <w:rFonts w:ascii="Cambria Math" w:hAnsi="Cambria Math" w:cs="Cambria Math"/>
-              </w:rPr>
-              <w:t>φ = a∨</w:t>
+            </w:pPr>
+          </w:p>
+        </w:tc>
+        <w:tc>
+          <w:tcPr>
+            <w:tcW w:w="2882" w:type="dxa"/>
+            <w:vAlign w:val="center"/>
+          </w:tcPr>
+          <w:p>
+            <w:pPr>
+              <w:pStyle w:val="ListParagraph"/>
+              <w:ind w:left="0"/>
+              <w:jc w:val="center"/>
+            </w:pPr>
+            <w:r>
+              <w:t>φ = a</w:t>
+            </w:r>
+            <w:r>
+              <w:rPr>
+                <w:rFonts w:ascii="Cambria Math" w:hAnsi="Cambria Math" w:cs="Cambria Math"/>
+              </w:rPr>
+              <w:t>∨</w:t>
             </w:r>
           </w:p>
         </w:tc>
@@ -2732,30 +2877,21 @@
               <w:pStyle w:val="ListParagraph"/>
               <w:ind w:left="0"/>
               <w:jc w:val="center"/>
-              <w:rPr>
-                <w:rFonts w:ascii="Cambria Math" w:hAnsi="Cambria Math" w:cs="Cambria Math"/>
-              </w:rPr>
-            </w:pPr>
-          </w:p>
-        </w:tc>
-        <w:tc>
-          <w:tcPr>
-            <w:tcW w:w="2882" w:type="dxa"/>
-            <w:vAlign w:val="center"/>
-          </w:tcPr>
-          <w:p>
-            <w:pPr>
-              <w:pStyle w:val="ListParagraph"/>
-              <w:ind w:left="0"/>
-              <w:jc w:val="center"/>
-              <w:rPr>
-                <w:rFonts w:ascii="Cambria Math" w:hAnsi="Cambria Math" w:cs="Cambria Math"/>
-              </w:rPr>
-            </w:pPr>
-            <w:r>
-              <w:rPr>
-                <w:rFonts w:ascii="Cambria Math" w:hAnsi="Cambria Math" w:cs="Cambria Math"/>
-              </w:rPr>
+            </w:pPr>
+          </w:p>
+        </w:tc>
+        <w:tc>
+          <w:tcPr>
+            <w:tcW w:w="2882" w:type="dxa"/>
+            <w:vAlign w:val="center"/>
+          </w:tcPr>
+          <w:p>
+            <w:pPr>
+              <w:pStyle w:val="ListParagraph"/>
+              <w:ind w:left="0"/>
+              <w:jc w:val="center"/>
+            </w:pPr>
+            <w:r>
               <w:t>&gt; (φ)</w:t>
             </w:r>
           </w:p>
@@ -2792,31 +2928,31 @@
               <w:pStyle w:val="ListParagraph"/>
               <w:ind w:left="0"/>
               <w:jc w:val="center"/>
-              <w:rPr>
-                <w:rFonts w:ascii="Cambria Math" w:hAnsi="Cambria Math" w:cs="Cambria Math"/>
-              </w:rPr>
-            </w:pPr>
-          </w:p>
-        </w:tc>
-        <w:tc>
-          <w:tcPr>
-            <w:tcW w:w="2882" w:type="dxa"/>
-            <w:vAlign w:val="center"/>
-          </w:tcPr>
-          <w:p>
-            <w:pPr>
-              <w:pStyle w:val="ListParagraph"/>
-              <w:ind w:left="0"/>
-              <w:jc w:val="center"/>
-              <w:rPr>
-                <w:rFonts w:ascii="Cambria Math" w:hAnsi="Cambria Math" w:cs="Cambria Math"/>
-              </w:rPr>
-            </w:pPr>
-            <w:r>
-              <w:rPr>
-                <w:rFonts w:ascii="Cambria Math" w:hAnsi="Cambria Math" w:cs="Cambria Math"/>
-              </w:rPr>
-              <w:t>φ = a∨ &gt; (φ)</w:t>
+            </w:pPr>
+          </w:p>
+        </w:tc>
+        <w:tc>
+          <w:tcPr>
+            <w:tcW w:w="2882" w:type="dxa"/>
+            <w:vAlign w:val="center"/>
+          </w:tcPr>
+          <w:p>
+            <w:pPr>
+              <w:pStyle w:val="ListParagraph"/>
+              <w:ind w:left="0"/>
+              <w:jc w:val="center"/>
+            </w:pPr>
+            <w:r>
+              <w:t>φ = a</w:t>
+            </w:r>
+            <w:r>
+              <w:rPr>
+                <w:rFonts w:ascii="Cambria Math" w:hAnsi="Cambria Math" w:cs="Cambria Math"/>
+              </w:rPr>
+              <w:t>∨</w:t>
+            </w:r>
+            <w:r>
+              <w:t xml:space="preserve"> &gt; (φ)</w:t>
             </w:r>
           </w:p>
         </w:tc>
@@ -2852,31 +2988,37 @@
               <w:pStyle w:val="ListParagraph"/>
               <w:ind w:left="0"/>
               <w:jc w:val="center"/>
-              <w:rPr>
-                <w:rFonts w:ascii="Cambria Math" w:hAnsi="Cambria Math" w:cs="Cambria Math"/>
-              </w:rPr>
-            </w:pPr>
-          </w:p>
-        </w:tc>
-        <w:tc>
-          <w:tcPr>
-            <w:tcW w:w="2882" w:type="dxa"/>
-            <w:vAlign w:val="center"/>
-          </w:tcPr>
-          <w:p>
-            <w:pPr>
-              <w:pStyle w:val="ListParagraph"/>
-              <w:ind w:left="0"/>
-              <w:jc w:val="center"/>
-              <w:rPr>
-                <w:rFonts w:ascii="Cambria Math" w:hAnsi="Cambria Math" w:cs="Cambria Math"/>
-              </w:rPr>
-            </w:pPr>
-            <w:r>
-              <w:rPr>
-                <w:rFonts w:ascii="Cambria Math" w:hAnsi="Cambria Math" w:cs="Cambria Math"/>
-              </w:rPr>
-              <w:t>∀φ(φ = a∨ &gt; (φ))</w:t>
+            </w:pPr>
+          </w:p>
+        </w:tc>
+        <w:tc>
+          <w:tcPr>
+            <w:tcW w:w="2882" w:type="dxa"/>
+            <w:vAlign w:val="center"/>
+          </w:tcPr>
+          <w:p>
+            <w:pPr>
+              <w:pStyle w:val="ListParagraph"/>
+              <w:ind w:left="0"/>
+              <w:jc w:val="center"/>
+            </w:pPr>
+            <w:r>
+              <w:rPr>
+                <w:rFonts w:ascii="Cambria Math" w:hAnsi="Cambria Math" w:cs="Cambria Math"/>
+              </w:rPr>
+              <w:t>∀</w:t>
+            </w:r>
+            <w:r>
+              <w:t>φ(φ = a</w:t>
+            </w:r>
+            <w:r>
+              <w:rPr>
+                <w:rFonts w:ascii="Cambria Math" w:hAnsi="Cambria Math" w:cs="Cambria Math"/>
+              </w:rPr>
+              <w:t>∨</w:t>
+            </w:r>
+            <w:r>
+              <w:t xml:space="preserve"> &gt; (φ))</w:t>
             </w:r>
           </w:p>
         </w:tc>
@@ -2912,50 +3054,49 @@
               <w:pStyle w:val="ListParagraph"/>
               <w:ind w:left="0"/>
               <w:jc w:val="center"/>
-              <w:rPr>
-                <w:rFonts w:ascii="Cambria Math" w:hAnsi="Cambria Math" w:cs="Cambria Math"/>
-              </w:rPr>
-            </w:pPr>
-          </w:p>
-        </w:tc>
-        <w:tc>
-          <w:tcPr>
-            <w:tcW w:w="2882" w:type="dxa"/>
-            <w:vAlign w:val="center"/>
-          </w:tcPr>
-          <w:p>
-            <w:pPr>
-              <w:pStyle w:val="ListParagraph"/>
-              <w:ind w:left="0"/>
-              <w:jc w:val="center"/>
-              <w:rPr>
-                <w:rFonts w:ascii="Cambria Math" w:hAnsi="Cambria Math" w:cs="Cambria Math"/>
-              </w:rPr>
-            </w:pPr>
-            <w:r>
-              <w:rPr>
-                <w:rFonts w:ascii="Cambria Math" w:hAnsi="Cambria Math" w:cs="Cambria Math"/>
-              </w:rPr>
+            </w:pPr>
+          </w:p>
+        </w:tc>
+        <w:tc>
+          <w:tcPr>
+            <w:tcW w:w="2882" w:type="dxa"/>
+            <w:vAlign w:val="center"/>
+          </w:tcPr>
+          <w:p>
+            <w:pPr>
+              <w:pStyle w:val="ListParagraph"/>
+              <w:ind w:left="0"/>
+              <w:jc w:val="center"/>
+            </w:pPr>
+            <w:r>
               <w:t>(2</w:t>
             </w:r>
             <w:r>
               <w:rPr>
-                <w:rFonts w:ascii="Cambria Math" w:hAnsi="Cambria Math" w:cs="Cambria Math"/>
                 <w:vertAlign w:val="superscript"/>
               </w:rPr>
               <w:t>4</w:t>
             </w:r>
             <w:r>
-              <w:rPr>
-                <w:rFonts w:ascii="Cambria Math" w:hAnsi="Cambria Math" w:cs="Cambria Math"/>
-              </w:rPr>
-              <w:t xml:space="preserve"> ≠</w:t>
-            </w:r>
-            <w:r>
-              <w:rPr>
-                <w:rFonts w:ascii="Cambria Math" w:hAnsi="Cambria Math" w:cs="Cambria Math"/>
-              </w:rPr>
-              <w:t xml:space="preserve"> δ → &lt; (|38|, 75, 3)) → ∀φ(φ = a∨ &gt; (φ))</w:t>
+              <w:t xml:space="preserve"> ≠ δ → &lt; (|38|, 75, 3)) → </w:t>
+            </w:r>
+            <w:r>
+              <w:rPr>
+                <w:rFonts w:ascii="Cambria Math" w:hAnsi="Cambria Math" w:cs="Cambria Math"/>
+              </w:rPr>
+              <w:t>∀</w:t>
+            </w:r>
+            <w:r>
+              <w:t>φ(φ = a</w:t>
+            </w:r>
+            <w:r>
+              <w:rPr>
+                <w:rFonts w:ascii="Cambria Math" w:hAnsi="Cambria Math" w:cs="Cambria Math"/>
+              </w:rPr>
+              <w:t>∨</w:t>
+            </w:r>
+            <w:r>
+              <w:t xml:space="preserve"> &gt; (φ))</w:t>
             </w:r>
           </w:p>
         </w:tc>
@@ -2991,50 +3132,55 @@
               <w:pStyle w:val="ListParagraph"/>
               <w:ind w:left="0"/>
               <w:jc w:val="center"/>
-              <w:rPr>
-                <w:rFonts w:ascii="Cambria Math" w:hAnsi="Cambria Math" w:cs="Cambria Math"/>
-              </w:rPr>
-            </w:pPr>
-          </w:p>
-        </w:tc>
-        <w:tc>
-          <w:tcPr>
-            <w:tcW w:w="2882" w:type="dxa"/>
-            <w:vAlign w:val="center"/>
-          </w:tcPr>
-          <w:p>
-            <w:pPr>
-              <w:pStyle w:val="ListParagraph"/>
-              <w:ind w:left="0"/>
-              <w:jc w:val="center"/>
-              <w:rPr>
-                <w:rFonts w:ascii="Cambria Math" w:hAnsi="Cambria Math" w:cs="Cambria Math"/>
-              </w:rPr>
-            </w:pPr>
-            <w:r>
-              <w:rPr>
-                <w:rFonts w:ascii="Cambria Math" w:hAnsi="Cambria Math" w:cs="Cambria Math"/>
-              </w:rPr>
-              <w:t>∃x((2</w:t>
-            </w:r>
-            <w:r>
-              <w:rPr>
-                <w:rFonts w:ascii="Cambria Math" w:hAnsi="Cambria Math" w:cs="Cambria Math"/>
+            </w:pPr>
+          </w:p>
+        </w:tc>
+        <w:tc>
+          <w:tcPr>
+            <w:tcW w:w="2882" w:type="dxa"/>
+            <w:vAlign w:val="center"/>
+          </w:tcPr>
+          <w:p>
+            <w:pPr>
+              <w:pStyle w:val="ListParagraph"/>
+              <w:ind w:left="0"/>
+              <w:jc w:val="center"/>
+            </w:pPr>
+            <w:r>
+              <w:rPr>
+                <w:rFonts w:ascii="Cambria Math" w:hAnsi="Cambria Math" w:cs="Cambria Math"/>
+              </w:rPr>
+              <w:t>∃</w:t>
+            </w:r>
+            <w:r>
+              <w:t>x((2</w:t>
+            </w:r>
+            <w:r>
+              <w:rPr>
                 <w:vertAlign w:val="superscript"/>
               </w:rPr>
               <w:t>4</w:t>
             </w:r>
             <w:r>
-              <w:rPr>
-                <w:rFonts w:ascii="Cambria Math" w:hAnsi="Cambria Math" w:cs="Cambria Math"/>
-              </w:rPr>
-              <w:t xml:space="preserve"> ≠</w:t>
-            </w:r>
-            <w:r>
-              <w:rPr>
-                <w:rFonts w:ascii="Cambria Math" w:hAnsi="Cambria Math" w:cs="Cambria Math"/>
-              </w:rPr>
-              <w:t xml:space="preserve"> δ → &lt; (|38|, 75, 3)) → ∀φ(φ = a∨ &gt; (φ)))</w:t>
+              <w:t xml:space="preserve"> ≠ δ → &lt; (|38|, 75, 3)) → </w:t>
+            </w:r>
+            <w:r>
+              <w:rPr>
+                <w:rFonts w:ascii="Cambria Math" w:hAnsi="Cambria Math" w:cs="Cambria Math"/>
+              </w:rPr>
+              <w:t>∀</w:t>
+            </w:r>
+            <w:r>
+              <w:t>φ(φ = a</w:t>
+            </w:r>
+            <w:r>
+              <w:rPr>
+                <w:rFonts w:ascii="Cambria Math" w:hAnsi="Cambria Math" w:cs="Cambria Math"/>
+              </w:rPr>
+              <w:t>∨</w:t>
+            </w:r>
+            <w:r>
+              <w:t xml:space="preserve"> &gt; (φ)))</w:t>
             </w:r>
           </w:p>
         </w:tc>
@@ -3070,9 +3216,6 @@
               <w:pStyle w:val="ListParagraph"/>
               <w:ind w:left="0"/>
               <w:jc w:val="center"/>
-              <w:rPr>
-                <w:rFonts w:ascii="Cambria Math" w:hAnsi="Cambria Math" w:cs="Cambria Math"/>
-              </w:rPr>
             </w:pPr>
           </w:p>
         </w:tc>
@@ -3093,38 +3236,44 @@
               </w:rPr>
               <w:t>∃</w:t>
             </w:r>
-            <w:proofErr w:type="spellStart"/>
-            <w:r>
-              <w:rPr>
-                <w:rFonts w:ascii="Cambria Math" w:hAnsi="Cambria Math" w:cs="Cambria Math"/>
-              </w:rPr>
-              <w:t>δ∃x</w:t>
-            </w:r>
-            <w:proofErr w:type="spellEnd"/>
-            <w:r>
-              <w:rPr>
-                <w:rFonts w:ascii="Cambria Math" w:hAnsi="Cambria Math" w:cs="Cambria Math"/>
-              </w:rPr>
-              <w:t>((2</w:t>
-            </w:r>
-            <w:r>
-              <w:rPr>
-                <w:rFonts w:ascii="Cambria Math" w:hAnsi="Cambria Math" w:cs="Cambria Math"/>
+            <w:r>
+              <w:t>δ</w:t>
+            </w:r>
+            <w:r>
+              <w:rPr>
+                <w:rFonts w:ascii="Cambria Math" w:hAnsi="Cambria Math" w:cs="Cambria Math"/>
+              </w:rPr>
+              <w:t>∃</w:t>
+            </w:r>
+            <w:r>
+              <w:t>x((2</w:t>
+            </w:r>
+            <w:r>
+              <w:rPr>
                 <w:vertAlign w:val="superscript"/>
               </w:rPr>
               <w:t>4</w:t>
             </w:r>
             <w:r>
-              <w:rPr>
-                <w:rFonts w:ascii="Cambria Math" w:hAnsi="Cambria Math" w:cs="Cambria Math"/>
-              </w:rPr>
-              <w:t xml:space="preserve"> ≠</w:t>
-            </w:r>
-            <w:r>
-              <w:rPr>
-                <w:rFonts w:ascii="Cambria Math" w:hAnsi="Cambria Math" w:cs="Cambria Math"/>
-              </w:rPr>
-              <w:t xml:space="preserve"> δ → &lt; (|38|, 75, 3)) → ∀φ(φ = a∨ &gt; (φ)))</w:t>
+              <w:t xml:space="preserve"> ≠ δ → &lt; (|38|, 75, 3)) → </w:t>
+            </w:r>
+            <w:r>
+              <w:rPr>
+                <w:rFonts w:ascii="Cambria Math" w:hAnsi="Cambria Math" w:cs="Cambria Math"/>
+              </w:rPr>
+              <w:t>∀</w:t>
+            </w:r>
+            <w:r>
+              <w:t>φ(φ = a</w:t>
+            </w:r>
+            <w:r>
+              <w:rPr>
+                <w:rFonts w:ascii="Cambria Math" w:hAnsi="Cambria Math" w:cs="Cambria Math"/>
+              </w:rPr>
+              <w:t>∨</w:t>
+            </w:r>
+            <w:r>
+              <w:t xml:space="preserve"> &gt; (φ)))</w:t>
             </w:r>
           </w:p>
         </w:tc>
@@ -3164,51 +3313,59 @@
               </w:rPr>
               <w:t>∀</w:t>
             </w:r>
-            <w:proofErr w:type="spellStart"/>
-            <w:r>
-              <w:rPr>
-                <w:rFonts w:ascii="Cambria Math" w:hAnsi="Cambria Math" w:cs="Cambria Math"/>
-              </w:rPr>
-              <w:t>x∀z∃y</w:t>
-            </w:r>
-            <w:proofErr w:type="spellEnd"/>
-            <w:r>
-              <w:rPr>
-                <w:rFonts w:ascii="Cambria Math" w:hAnsi="Cambria Math" w:cs="Cambria Math"/>
-              </w:rPr>
-              <w:t xml:space="preserve">(R(ε(x), g(y, z)) → A ∨ (B(f (g(x, y))) ∧ R(δ(σ(a, </w:t>
-            </w:r>
-            <w:proofErr w:type="spellStart"/>
-            <w:r>
-              <w:rPr>
-                <w:rFonts w:ascii="Cambria Math" w:hAnsi="Cambria Math" w:cs="Cambria Math"/>
-              </w:rPr>
-              <w:t>bc</w:t>
-            </w:r>
-            <w:proofErr w:type="spellEnd"/>
-            <w:r>
-              <w:rPr>
-                <w:rFonts w:ascii="Cambria Math" w:hAnsi="Cambria Math" w:cs="Cambria Math"/>
-              </w:rPr>
-              <w:t>)))))</w:t>
-            </w:r>
-          </w:p>
-        </w:tc>
-        <w:tc>
-          <w:tcPr>
-            <w:tcW w:w="2882" w:type="dxa"/>
-            <w:vAlign w:val="center"/>
-          </w:tcPr>
-          <w:p>
-            <w:pPr>
-              <w:pStyle w:val="ListParagraph"/>
-              <w:ind w:left="0"/>
-              <w:jc w:val="center"/>
-            </w:pPr>
-            <w:r>
-              <w:rPr>
-                <w:rFonts w:ascii="Cambria Math" w:hAnsi="Cambria Math" w:cs="Cambria Math"/>
-              </w:rPr>
+            <w:r>
+              <w:t>x</w:t>
+            </w:r>
+            <w:r>
+              <w:rPr>
+                <w:rFonts w:ascii="Cambria Math" w:hAnsi="Cambria Math" w:cs="Cambria Math"/>
+              </w:rPr>
+              <w:t>∀</w:t>
+            </w:r>
+            <w:r>
+              <w:t>z</w:t>
+            </w:r>
+            <w:r>
+              <w:rPr>
+                <w:rFonts w:ascii="Cambria Math" w:hAnsi="Cambria Math" w:cs="Cambria Math"/>
+              </w:rPr>
+              <w:t>∃</w:t>
+            </w:r>
+            <w:r>
+              <w:t xml:space="preserve">y(R(ε(x), g(y, z)) → A </w:t>
+            </w:r>
+            <w:r>
+              <w:rPr>
+                <w:rFonts w:ascii="Cambria Math" w:hAnsi="Cambria Math" w:cs="Cambria Math"/>
+              </w:rPr>
+              <w:t>∨</w:t>
+            </w:r>
+            <w:r>
+              <w:t xml:space="preserve"> (B(f (g(x, y))) </w:t>
+            </w:r>
+            <w:r>
+              <w:rPr>
+                <w:rFonts w:ascii="Cambria Math" w:hAnsi="Cambria Math" w:cs="Cambria Math"/>
+              </w:rPr>
+              <w:t>∧</w:t>
+            </w:r>
+            <w:r>
+              <w:t xml:space="preserve"> R(δ(σ(a, bc)))))</w:t>
+            </w:r>
+          </w:p>
+        </w:tc>
+        <w:tc>
+          <w:tcPr>
+            <w:tcW w:w="2882" w:type="dxa"/>
+            <w:vAlign w:val="center"/>
+          </w:tcPr>
+          <w:p>
+            <w:pPr>
+              <w:pStyle w:val="ListParagraph"/>
+              <w:ind w:left="0"/>
+              <w:jc w:val="center"/>
+            </w:pPr>
+            <w:r>
               <w:t>R(ε(x), g(y, z))</w:t>
             </w:r>
           </w:p>
@@ -3242,27 +3399,21 @@
               <w:pStyle w:val="ListParagraph"/>
               <w:ind w:left="0"/>
               <w:jc w:val="center"/>
-              <w:rPr>
-                <w:rFonts w:ascii="Cambria Math" w:hAnsi="Cambria Math" w:cs="Cambria Math"/>
-              </w:rPr>
-            </w:pPr>
-          </w:p>
-        </w:tc>
-        <w:tc>
-          <w:tcPr>
-            <w:tcW w:w="2882" w:type="dxa"/>
-            <w:vAlign w:val="center"/>
-          </w:tcPr>
-          <w:p>
-            <w:pPr>
-              <w:pStyle w:val="ListParagraph"/>
-              <w:ind w:left="0"/>
-              <w:jc w:val="center"/>
-            </w:pPr>
-            <w:r>
-              <w:rPr>
-                <w:rFonts w:ascii="Cambria Math" w:hAnsi="Cambria Math" w:cs="Cambria Math"/>
-              </w:rPr>
+            </w:pPr>
+          </w:p>
+        </w:tc>
+        <w:tc>
+          <w:tcPr>
+            <w:tcW w:w="2882" w:type="dxa"/>
+            <w:vAlign w:val="center"/>
+          </w:tcPr>
+          <w:p>
+            <w:pPr>
+              <w:pStyle w:val="ListParagraph"/>
+              <w:ind w:left="0"/>
+              <w:jc w:val="center"/>
+            </w:pPr>
+            <w:r>
               <w:t>A</w:t>
             </w:r>
           </w:p>
@@ -3296,27 +3447,21 @@
               <w:pStyle w:val="ListParagraph"/>
               <w:ind w:left="0"/>
               <w:jc w:val="center"/>
-              <w:rPr>
-                <w:rFonts w:ascii="Cambria Math" w:hAnsi="Cambria Math" w:cs="Cambria Math"/>
-              </w:rPr>
-            </w:pPr>
-          </w:p>
-        </w:tc>
-        <w:tc>
-          <w:tcPr>
-            <w:tcW w:w="2882" w:type="dxa"/>
-            <w:vAlign w:val="center"/>
-          </w:tcPr>
-          <w:p>
-            <w:pPr>
-              <w:pStyle w:val="ListParagraph"/>
-              <w:ind w:left="0"/>
-              <w:jc w:val="center"/>
-            </w:pPr>
-            <w:r>
-              <w:rPr>
-                <w:rFonts w:ascii="Cambria Math" w:hAnsi="Cambria Math" w:cs="Cambria Math"/>
-              </w:rPr>
+            </w:pPr>
+          </w:p>
+        </w:tc>
+        <w:tc>
+          <w:tcPr>
+            <w:tcW w:w="2882" w:type="dxa"/>
+            <w:vAlign w:val="center"/>
+          </w:tcPr>
+          <w:p>
+            <w:pPr>
+              <w:pStyle w:val="ListParagraph"/>
+              <w:ind w:left="0"/>
+              <w:jc w:val="center"/>
+            </w:pPr>
+            <w:r>
               <w:t>B(f (g(x, y)))</w:t>
             </w:r>
           </w:p>
@@ -3353,45 +3498,22 @@
               <w:pStyle w:val="ListParagraph"/>
               <w:ind w:left="0"/>
               <w:jc w:val="center"/>
-              <w:rPr>
-                <w:rFonts w:ascii="Cambria Math" w:hAnsi="Cambria Math" w:cs="Cambria Math"/>
-              </w:rPr>
-            </w:pPr>
-          </w:p>
-        </w:tc>
-        <w:tc>
-          <w:tcPr>
-            <w:tcW w:w="2882" w:type="dxa"/>
-            <w:vAlign w:val="center"/>
-          </w:tcPr>
-          <w:p>
-            <w:pPr>
-              <w:pStyle w:val="ListParagraph"/>
-              <w:ind w:left="0"/>
-              <w:jc w:val="center"/>
-              <w:rPr>
-                <w:rFonts w:ascii="Cambria Math" w:hAnsi="Cambria Math" w:cs="Cambria Math"/>
-              </w:rPr>
-            </w:pPr>
-            <w:r>
-              <w:rPr>
-                <w:rFonts w:ascii="Cambria Math" w:hAnsi="Cambria Math" w:cs="Cambria Math"/>
-              </w:rPr>
-              <w:t xml:space="preserve">R(δ(σ(a, </w:t>
-            </w:r>
-            <w:proofErr w:type="spellStart"/>
-            <w:r>
-              <w:rPr>
-                <w:rFonts w:ascii="Cambria Math" w:hAnsi="Cambria Math" w:cs="Cambria Math"/>
-              </w:rPr>
-              <w:t>bc</w:t>
-            </w:r>
-            <w:proofErr w:type="spellEnd"/>
-            <w:r>
-              <w:rPr>
-                <w:rFonts w:ascii="Cambria Math" w:hAnsi="Cambria Math" w:cs="Cambria Math"/>
-              </w:rPr>
-              <w:t>)))</w:t>
+            </w:pPr>
+          </w:p>
+        </w:tc>
+        <w:tc>
+          <w:tcPr>
+            <w:tcW w:w="2882" w:type="dxa"/>
+            <w:vAlign w:val="center"/>
+          </w:tcPr>
+          <w:p>
+            <w:pPr>
+              <w:pStyle w:val="ListParagraph"/>
+              <w:ind w:left="0"/>
+              <w:jc w:val="center"/>
+            </w:pPr>
+            <w:r>
+              <w:t>R(δ(σ(a, bc)))</w:t>
             </w:r>
           </w:p>
         </w:tc>
@@ -3427,31 +3549,31 @@
               <w:pStyle w:val="ListParagraph"/>
               <w:ind w:left="0"/>
               <w:jc w:val="center"/>
-              <w:rPr>
-                <w:rFonts w:ascii="Cambria Math" w:hAnsi="Cambria Math" w:cs="Cambria Math"/>
-              </w:rPr>
-            </w:pPr>
-          </w:p>
-        </w:tc>
-        <w:tc>
-          <w:tcPr>
-            <w:tcW w:w="2882" w:type="dxa"/>
-            <w:vAlign w:val="center"/>
-          </w:tcPr>
-          <w:p>
-            <w:pPr>
-              <w:pStyle w:val="ListParagraph"/>
-              <w:ind w:left="0"/>
-              <w:jc w:val="center"/>
-              <w:rPr>
-                <w:rFonts w:ascii="Cambria Math" w:hAnsi="Cambria Math" w:cs="Cambria Math"/>
-              </w:rPr>
-            </w:pPr>
-            <w:r>
-              <w:rPr>
-                <w:rFonts w:ascii="Cambria Math" w:hAnsi="Cambria Math" w:cs="Cambria Math"/>
-              </w:rPr>
-              <w:t>A ∨ (B(f (g(x, y)))</w:t>
+            </w:pPr>
+          </w:p>
+        </w:tc>
+        <w:tc>
+          <w:tcPr>
+            <w:tcW w:w="2882" w:type="dxa"/>
+            <w:vAlign w:val="center"/>
+          </w:tcPr>
+          <w:p>
+            <w:pPr>
+              <w:pStyle w:val="ListParagraph"/>
+              <w:ind w:left="0"/>
+              <w:jc w:val="center"/>
+            </w:pPr>
+            <w:r>
+              <w:t xml:space="preserve">A </w:t>
+            </w:r>
+            <w:r>
+              <w:rPr>
+                <w:rFonts w:ascii="Cambria Math" w:hAnsi="Cambria Math" w:cs="Cambria Math"/>
+              </w:rPr>
+              <w:t>∨</w:t>
+            </w:r>
+            <w:r>
+              <w:t xml:space="preserve"> (B(f (g(x, y)))</w:t>
             </w:r>
           </w:p>
         </w:tc>
@@ -3487,45 +3609,40 @@
               <w:pStyle w:val="ListParagraph"/>
               <w:ind w:left="0"/>
               <w:jc w:val="center"/>
-              <w:rPr>
-                <w:rFonts w:ascii="Cambria Math" w:hAnsi="Cambria Math" w:cs="Cambria Math"/>
-              </w:rPr>
-            </w:pPr>
-          </w:p>
-        </w:tc>
-        <w:tc>
-          <w:tcPr>
-            <w:tcW w:w="2882" w:type="dxa"/>
-            <w:vAlign w:val="center"/>
-          </w:tcPr>
-          <w:p>
-            <w:pPr>
-              <w:pStyle w:val="ListParagraph"/>
-              <w:ind w:left="0"/>
-              <w:jc w:val="center"/>
-              <w:rPr>
-                <w:rFonts w:ascii="Cambria Math" w:hAnsi="Cambria Math" w:cs="Cambria Math"/>
-              </w:rPr>
-            </w:pPr>
-            <w:r>
-              <w:rPr>
-                <w:rFonts w:ascii="Cambria Math" w:hAnsi="Cambria Math" w:cs="Cambria Math"/>
-              </w:rPr>
-              <w:t xml:space="preserve">A ∨ (B(f (g(x, y))) ∧ R(δ(σ(a, </w:t>
-            </w:r>
-            <w:proofErr w:type="spellStart"/>
-            <w:r>
-              <w:rPr>
-                <w:rFonts w:ascii="Cambria Math" w:hAnsi="Cambria Math" w:cs="Cambria Math"/>
-              </w:rPr>
-              <w:t>bc</w:t>
-            </w:r>
-            <w:proofErr w:type="spellEnd"/>
-            <w:r>
-              <w:rPr>
-                <w:rFonts w:ascii="Cambria Math" w:hAnsi="Cambria Math" w:cs="Cambria Math"/>
-              </w:rPr>
-              <w:t>)))</w:t>
+            </w:pPr>
+          </w:p>
+        </w:tc>
+        <w:tc>
+          <w:tcPr>
+            <w:tcW w:w="2882" w:type="dxa"/>
+            <w:vAlign w:val="center"/>
+          </w:tcPr>
+          <w:p>
+            <w:pPr>
+              <w:pStyle w:val="ListParagraph"/>
+              <w:ind w:left="0"/>
+              <w:jc w:val="center"/>
+            </w:pPr>
+            <w:r>
+              <w:t xml:space="preserve">A </w:t>
+            </w:r>
+            <w:r>
+              <w:rPr>
+                <w:rFonts w:ascii="Cambria Math" w:hAnsi="Cambria Math" w:cs="Cambria Math"/>
+              </w:rPr>
+              <w:t>∨</w:t>
+            </w:r>
+            <w:r>
+              <w:t xml:space="preserve"> (B(f (g(x, y))) </w:t>
+            </w:r>
+            <w:r>
+              <w:rPr>
+                <w:rFonts w:ascii="Cambria Math" w:hAnsi="Cambria Math" w:cs="Cambria Math"/>
+              </w:rPr>
+              <w:t>∧</w:t>
+            </w:r>
+            <w:r>
+              <w:t xml:space="preserve"> R(δ(σ(a, bc)))</w:t>
             </w:r>
           </w:p>
         </w:tc>
@@ -3561,45 +3678,40 @@
               <w:pStyle w:val="ListParagraph"/>
               <w:ind w:left="0"/>
               <w:jc w:val="center"/>
-              <w:rPr>
-                <w:rFonts w:ascii="Cambria Math" w:hAnsi="Cambria Math" w:cs="Cambria Math"/>
-              </w:rPr>
-            </w:pPr>
-          </w:p>
-        </w:tc>
-        <w:tc>
-          <w:tcPr>
-            <w:tcW w:w="2882" w:type="dxa"/>
-            <w:vAlign w:val="center"/>
-          </w:tcPr>
-          <w:p>
-            <w:pPr>
-              <w:pStyle w:val="ListParagraph"/>
-              <w:ind w:left="0"/>
-              <w:jc w:val="center"/>
-              <w:rPr>
-                <w:rFonts w:ascii="Cambria Math" w:hAnsi="Cambria Math" w:cs="Cambria Math"/>
-              </w:rPr>
-            </w:pPr>
-            <w:r>
-              <w:rPr>
-                <w:rFonts w:ascii="Cambria Math" w:hAnsi="Cambria Math" w:cs="Cambria Math"/>
-              </w:rPr>
-              <w:t xml:space="preserve">R(ε(x), g(y, z)) → A ∨ (B(f (g(x, y))) ∧ R(δ(σ(a, </w:t>
-            </w:r>
-            <w:proofErr w:type="spellStart"/>
-            <w:r>
-              <w:rPr>
-                <w:rFonts w:ascii="Cambria Math" w:hAnsi="Cambria Math" w:cs="Cambria Math"/>
-              </w:rPr>
-              <w:t>bc</w:t>
-            </w:r>
-            <w:proofErr w:type="spellEnd"/>
-            <w:r>
-              <w:rPr>
-                <w:rFonts w:ascii="Cambria Math" w:hAnsi="Cambria Math" w:cs="Cambria Math"/>
-              </w:rPr>
-              <w:t>))))</w:t>
+            </w:pPr>
+          </w:p>
+        </w:tc>
+        <w:tc>
+          <w:tcPr>
+            <w:tcW w:w="2882" w:type="dxa"/>
+            <w:vAlign w:val="center"/>
+          </w:tcPr>
+          <w:p>
+            <w:pPr>
+              <w:pStyle w:val="ListParagraph"/>
+              <w:ind w:left="0"/>
+              <w:jc w:val="center"/>
+            </w:pPr>
+            <w:r>
+              <w:t xml:space="preserve">R(ε(x), g(y, z)) → A </w:t>
+            </w:r>
+            <w:r>
+              <w:rPr>
+                <w:rFonts w:ascii="Cambria Math" w:hAnsi="Cambria Math" w:cs="Cambria Math"/>
+              </w:rPr>
+              <w:t>∨</w:t>
+            </w:r>
+            <w:r>
+              <w:t xml:space="preserve"> (B(f (g(x, y))) </w:t>
+            </w:r>
+            <w:r>
+              <w:rPr>
+                <w:rFonts w:ascii="Cambria Math" w:hAnsi="Cambria Math" w:cs="Cambria Math"/>
+              </w:rPr>
+              <w:t>∧</w:t>
+            </w:r>
+            <w:r>
+              <w:t xml:space="preserve"> R(δ(σ(a, bc))))</w:t>
             </w:r>
           </w:p>
         </w:tc>
@@ -3635,45 +3747,46 @@
               <w:pStyle w:val="ListParagraph"/>
               <w:ind w:left="0"/>
               <w:jc w:val="center"/>
-              <w:rPr>
-                <w:rFonts w:ascii="Cambria Math" w:hAnsi="Cambria Math" w:cs="Cambria Math"/>
-              </w:rPr>
-            </w:pPr>
-          </w:p>
-        </w:tc>
-        <w:tc>
-          <w:tcPr>
-            <w:tcW w:w="2882" w:type="dxa"/>
-            <w:vAlign w:val="center"/>
-          </w:tcPr>
-          <w:p>
-            <w:pPr>
-              <w:pStyle w:val="ListParagraph"/>
-              <w:ind w:left="0"/>
-              <w:jc w:val="center"/>
-              <w:rPr>
-                <w:rFonts w:ascii="Cambria Math" w:hAnsi="Cambria Math" w:cs="Cambria Math"/>
-              </w:rPr>
-            </w:pPr>
-            <w:r>
-              <w:rPr>
-                <w:rFonts w:ascii="Cambria Math" w:hAnsi="Cambria Math" w:cs="Cambria Math"/>
-              </w:rPr>
-              <w:t xml:space="preserve">∃y(R(ε(x), g(y, z)) → A ∨ (B(f (g(x, y))) ∧ R(δ(σ(a, </w:t>
-            </w:r>
-            <w:proofErr w:type="spellStart"/>
-            <w:r>
-              <w:rPr>
-                <w:rFonts w:ascii="Cambria Math" w:hAnsi="Cambria Math" w:cs="Cambria Math"/>
-              </w:rPr>
-              <w:t>bc</w:t>
-            </w:r>
-            <w:proofErr w:type="spellEnd"/>
-            <w:r>
-              <w:rPr>
-                <w:rFonts w:ascii="Cambria Math" w:hAnsi="Cambria Math" w:cs="Cambria Math"/>
-              </w:rPr>
-              <w:t>)))))</w:t>
+            </w:pPr>
+          </w:p>
+        </w:tc>
+        <w:tc>
+          <w:tcPr>
+            <w:tcW w:w="2882" w:type="dxa"/>
+            <w:vAlign w:val="center"/>
+          </w:tcPr>
+          <w:p>
+            <w:pPr>
+              <w:pStyle w:val="ListParagraph"/>
+              <w:ind w:left="0"/>
+              <w:jc w:val="center"/>
+            </w:pPr>
+            <w:r>
+              <w:rPr>
+                <w:rFonts w:ascii="Cambria Math" w:hAnsi="Cambria Math" w:cs="Cambria Math"/>
+              </w:rPr>
+              <w:t>∃</w:t>
+            </w:r>
+            <w:r>
+              <w:t xml:space="preserve">y(R(ε(x), g(y, z)) → A </w:t>
+            </w:r>
+            <w:r>
+              <w:rPr>
+                <w:rFonts w:ascii="Cambria Math" w:hAnsi="Cambria Math" w:cs="Cambria Math"/>
+              </w:rPr>
+              <w:t>∨</w:t>
+            </w:r>
+            <w:r>
+              <w:t xml:space="preserve"> (B(f (g(x, y))) </w:t>
+            </w:r>
+            <w:r>
+              <w:rPr>
+                <w:rFonts w:ascii="Cambria Math" w:hAnsi="Cambria Math" w:cs="Cambria Math"/>
+              </w:rPr>
+              <w:t>∧</w:t>
+            </w:r>
+            <w:r>
+              <w:t xml:space="preserve"> R(δ(σ(a, bc)))))</w:t>
             </w:r>
           </w:p>
         </w:tc>
@@ -3709,25 +3822,19 @@
               <w:pStyle w:val="ListParagraph"/>
               <w:ind w:left="0"/>
               <w:jc w:val="center"/>
-              <w:rPr>
-                <w:rFonts w:ascii="Cambria Math" w:hAnsi="Cambria Math" w:cs="Cambria Math"/>
-              </w:rPr>
-            </w:pPr>
-          </w:p>
-        </w:tc>
-        <w:tc>
-          <w:tcPr>
-            <w:tcW w:w="2882" w:type="dxa"/>
-            <w:vAlign w:val="center"/>
-          </w:tcPr>
-          <w:p>
-            <w:pPr>
-              <w:pStyle w:val="ListParagraph"/>
-              <w:ind w:left="0"/>
-              <w:jc w:val="center"/>
-              <w:rPr>
-                <w:rFonts w:ascii="Cambria Math" w:hAnsi="Cambria Math" w:cs="Cambria Math"/>
-              </w:rPr>
+            </w:pPr>
+          </w:p>
+        </w:tc>
+        <w:tc>
+          <w:tcPr>
+            <w:tcW w:w="2882" w:type="dxa"/>
+            <w:vAlign w:val="center"/>
+          </w:tcPr>
+          <w:p>
+            <w:pPr>
+              <w:pStyle w:val="ListParagraph"/>
+              <w:ind w:left="0"/>
+              <w:jc w:val="center"/>
             </w:pPr>
             <w:r>
               <w:rPr>
@@ -3735,33 +3842,35 @@
               </w:rPr>
               <w:t>∀</w:t>
             </w:r>
-            <w:proofErr w:type="spellStart"/>
-            <w:r>
-              <w:rPr>
-                <w:rFonts w:ascii="Cambria Math" w:hAnsi="Cambria Math" w:cs="Cambria Math"/>
-              </w:rPr>
-              <w:t>z∃y</w:t>
-            </w:r>
-            <w:proofErr w:type="spellEnd"/>
-            <w:r>
-              <w:rPr>
-                <w:rFonts w:ascii="Cambria Math" w:hAnsi="Cambria Math" w:cs="Cambria Math"/>
-              </w:rPr>
-              <w:t xml:space="preserve">(R(ε(x), g(y, z)) → A ∨ (B(f (g(x, y))) ∧ R(δ(σ(a, </w:t>
-            </w:r>
-            <w:proofErr w:type="spellStart"/>
-            <w:r>
-              <w:rPr>
-                <w:rFonts w:ascii="Cambria Math" w:hAnsi="Cambria Math" w:cs="Cambria Math"/>
-              </w:rPr>
-              <w:t>bc</w:t>
-            </w:r>
-            <w:proofErr w:type="spellEnd"/>
-            <w:r>
-              <w:rPr>
-                <w:rFonts w:ascii="Cambria Math" w:hAnsi="Cambria Math" w:cs="Cambria Math"/>
-              </w:rPr>
-              <w:t>)))))</w:t>
+            <w:r>
+              <w:t>z</w:t>
+            </w:r>
+            <w:r>
+              <w:rPr>
+                <w:rFonts w:ascii="Cambria Math" w:hAnsi="Cambria Math" w:cs="Cambria Math"/>
+              </w:rPr>
+              <w:t>∃</w:t>
+            </w:r>
+            <w:r>
+              <w:t xml:space="preserve">y(R(ε(x), g(y, z)) → A </w:t>
+            </w:r>
+            <w:r>
+              <w:rPr>
+                <w:rFonts w:ascii="Cambria Math" w:hAnsi="Cambria Math" w:cs="Cambria Math"/>
+              </w:rPr>
+              <w:t>∨</w:t>
+            </w:r>
+            <w:r>
+              <w:t xml:space="preserve"> (B(f (g(x, y))) </w:t>
+            </w:r>
+            <w:r>
+              <w:rPr>
+                <w:rFonts w:ascii="Cambria Math" w:hAnsi="Cambria Math" w:cs="Cambria Math"/>
+              </w:rPr>
+              <w:t>∧</w:t>
+            </w:r>
+            <w:r>
+              <w:t xml:space="preserve"> R(δ(σ(a, bc)))))</w:t>
             </w:r>
           </w:p>
         </w:tc>
@@ -3797,9 +3906,6 @@
               <w:pStyle w:val="ListParagraph"/>
               <w:ind w:left="0"/>
               <w:jc w:val="center"/>
-              <w:rPr>
-                <w:rFonts w:ascii="Cambria Math" w:hAnsi="Cambria Math" w:cs="Cambria Math"/>
-              </w:rPr>
             </w:pPr>
           </w:p>
         </w:tc>
@@ -3820,33 +3926,44 @@
               </w:rPr>
               <w:t>∀</w:t>
             </w:r>
-            <w:proofErr w:type="spellStart"/>
-            <w:r>
-              <w:rPr>
-                <w:rFonts w:ascii="Cambria Math" w:hAnsi="Cambria Math" w:cs="Cambria Math"/>
-              </w:rPr>
-              <w:t>x∀z∃y</w:t>
-            </w:r>
-            <w:proofErr w:type="spellEnd"/>
-            <w:r>
-              <w:rPr>
-                <w:rFonts w:ascii="Cambria Math" w:hAnsi="Cambria Math" w:cs="Cambria Math"/>
-              </w:rPr>
-              <w:t xml:space="preserve">(R(ε(x), g(y, z)) → A ∨ (B(f (g(x, y))) ∧ R(δ(σ(a, </w:t>
-            </w:r>
-            <w:proofErr w:type="spellStart"/>
-            <w:r>
-              <w:rPr>
-                <w:rFonts w:ascii="Cambria Math" w:hAnsi="Cambria Math" w:cs="Cambria Math"/>
-              </w:rPr>
-              <w:t>bc</w:t>
-            </w:r>
-            <w:proofErr w:type="spellEnd"/>
-            <w:r>
-              <w:rPr>
-                <w:rFonts w:ascii="Cambria Math" w:hAnsi="Cambria Math" w:cs="Cambria Math"/>
-              </w:rPr>
-              <w:t>)))))</w:t>
+            <w:r>
+              <w:t>x</w:t>
+            </w:r>
+            <w:r>
+              <w:rPr>
+                <w:rFonts w:ascii="Cambria Math" w:hAnsi="Cambria Math" w:cs="Cambria Math"/>
+              </w:rPr>
+              <w:t>∀</w:t>
+            </w:r>
+            <w:r>
+              <w:t>z</w:t>
+            </w:r>
+            <w:r>
+              <w:rPr>
+                <w:rFonts w:ascii="Cambria Math" w:hAnsi="Cambria Math" w:cs="Cambria Math"/>
+              </w:rPr>
+              <w:t>∃</w:t>
+            </w:r>
+            <w:r>
+              <w:t xml:space="preserve">y(R(ε(x), g(y, z)) → A </w:t>
+            </w:r>
+            <w:r>
+              <w:rPr>
+                <w:rFonts w:ascii="Cambria Math" w:hAnsi="Cambria Math" w:cs="Cambria Math"/>
+              </w:rPr>
+              <w:t>∨</w:t>
+            </w:r>
+            <w:r>
+              <w:t xml:space="preserve"> (B(f (g(x, y))) </w:t>
+            </w:r>
+            <w:r>
+              <w:rPr>
+                <w:rFonts w:ascii="Cambria Math" w:hAnsi="Cambria Math" w:cs="Cambria Math"/>
+              </w:rPr>
+              <w:t>∧</w:t>
+            </w:r>
+            <w:r>
+              <w:t xml:space="preserve"> R(δ(σ(a, bc)))))</w:t>
             </w:r>
           </w:p>
         </w:tc>
@@ -3863,6 +3980,430 @@
             </w:pPr>
             <w:r>
               <w:t>Closed</w:t>
+            </w:r>
+          </w:p>
+        </w:tc>
+      </w:tr>
+    </w:tbl>
+    <w:p/>
+    <w:p>
+      <w:pPr>
+        <w:rPr>
+          <w:b/>
+          <w:bCs/>
+        </w:rPr>
+      </w:pPr>
+      <w:r>
+        <w:rPr>
+          <w:b/>
+          <w:bCs/>
+        </w:rPr>
+        <w:t>Exercise 50</w:t>
+      </w:r>
+    </w:p>
+    <w:tbl>
+      <w:tblPr>
+        <w:tblStyle w:val="TableGrid"/>
+        <w:tblW w:w="0" w:type="auto"/>
+        <w:tblLook w:val="04A0" w:firstRow="1" w:lastRow="0" w:firstColumn="1" w:lastColumn="0" w:noHBand="0" w:noVBand="1"/>
+      </w:tblPr>
+      <w:tblGrid>
+        <w:gridCol w:w="4675"/>
+        <w:gridCol w:w="4675"/>
+      </w:tblGrid>
+      <w:tr>
+        <w:trPr>
+          <w:trHeight w:val="92"/>
+        </w:trPr>
+        <w:tc>
+          <w:tcPr>
+            <w:tcW w:w="4675" w:type="dxa"/>
+            <w:vMerge w:val="restart"/>
+            <w:vAlign w:val="center"/>
+          </w:tcPr>
+          <w:p>
+            <w:pPr>
+              <w:jc w:val="center"/>
+            </w:pPr>
+            <w:r>
+              <w:rPr>
+                <w:rFonts w:ascii="Cambria Math" w:hAnsi="Cambria Math" w:cs="Cambria Math"/>
+              </w:rPr>
+              <w:t>∀</w:t>
+            </w:r>
+            <w:r>
+              <w:t>w</w:t>
+            </w:r>
+            <w:r>
+              <w:rPr>
+                <w:rFonts w:ascii="Cambria Math" w:hAnsi="Cambria Math" w:cs="Cambria Math"/>
+              </w:rPr>
+              <w:t>∀</w:t>
+            </w:r>
+            <w:r>
+              <w:t>v</w:t>
+            </w:r>
+            <w:r>
+              <w:rPr>
+                <w:rFonts w:ascii="Cambria Math" w:hAnsi="Cambria Math" w:cs="Cambria Math"/>
+              </w:rPr>
+              <w:t>∃</w:t>
+            </w:r>
+            <w:r>
+              <w:t>z(R(w, v, w) → B(z, z))</w:t>
+            </w:r>
+          </w:p>
+        </w:tc>
+        <w:tc>
+          <w:tcPr>
+            <w:tcW w:w="4675" w:type="dxa"/>
+            <w:vAlign w:val="center"/>
+          </w:tcPr>
+          <w:p>
+            <w:pPr>
+              <w:jc w:val="center"/>
+            </w:pPr>
+            <w:r>
+              <w:t>U</w:t>
+            </w:r>
+            <w:r>
+              <w:rPr>
+                <w:vertAlign w:val="subscript"/>
+              </w:rPr>
+              <w:t>A</w:t>
+            </w:r>
+            <w:r>
+              <w:t xml:space="preserve"> = </w:t>
+            </w:r>
+            <w:r>
+              <w:t>N</w:t>
+            </w:r>
+            <w:r>
+              <w:t xml:space="preserve"> (natural numbers)</w:t>
+            </w:r>
+          </w:p>
+        </w:tc>
+      </w:tr>
+      <w:tr>
+        <w:trPr>
+          <w:trHeight w:val="92"/>
+        </w:trPr>
+        <w:tc>
+          <w:tcPr>
+            <w:tcW w:w="4675" w:type="dxa"/>
+            <w:vMerge/>
+            <w:vAlign w:val="center"/>
+          </w:tcPr>
+          <w:p>
+            <w:pPr>
+              <w:jc w:val="center"/>
+              <w:rPr>
+                <w:rFonts w:ascii="Cambria Math" w:hAnsi="Cambria Math" w:cs="Cambria Math"/>
+              </w:rPr>
+            </w:pPr>
+          </w:p>
+        </w:tc>
+        <w:tc>
+          <w:tcPr>
+            <w:tcW w:w="4675" w:type="dxa"/>
+            <w:vAlign w:val="center"/>
+          </w:tcPr>
+          <w:p>
+            <w:pPr>
+              <w:jc w:val="center"/>
+            </w:pPr>
+            <w:r>
+              <w:t>R</w:t>
+            </w:r>
+            <w:r>
+              <w:rPr>
+                <w:vertAlign w:val="superscript"/>
+              </w:rPr>
+              <w:t>A</w:t>
+            </w:r>
+            <w:r>
+              <w:t xml:space="preserve"> = {(x, y, z) | x &lt; y &lt; z}</w:t>
+            </w:r>
+          </w:p>
+        </w:tc>
+      </w:tr>
+      <w:tr>
+        <w:trPr>
+          <w:trHeight w:val="92"/>
+        </w:trPr>
+        <w:tc>
+          <w:tcPr>
+            <w:tcW w:w="4675" w:type="dxa"/>
+            <w:vMerge/>
+            <w:vAlign w:val="center"/>
+          </w:tcPr>
+          <w:p>
+            <w:pPr>
+              <w:jc w:val="center"/>
+              <w:rPr>
+                <w:rFonts w:ascii="Cambria Math" w:hAnsi="Cambria Math" w:cs="Cambria Math"/>
+              </w:rPr>
+            </w:pPr>
+          </w:p>
+        </w:tc>
+        <w:tc>
+          <w:tcPr>
+            <w:tcW w:w="4675" w:type="dxa"/>
+            <w:vAlign w:val="center"/>
+          </w:tcPr>
+          <w:p>
+            <w:pPr>
+              <w:jc w:val="center"/>
+            </w:pPr>
+            <w:r>
+              <w:t>B</w:t>
+            </w:r>
+            <w:r>
+              <w:rPr>
+                <w:vertAlign w:val="superscript"/>
+              </w:rPr>
+              <w:t>A</w:t>
+            </w:r>
+            <w:r>
+              <w:t xml:space="preserve"> = {(x, y) | x ≥ y}</w:t>
+            </w:r>
+          </w:p>
+        </w:tc>
+      </w:tr>
+      <w:tr>
+        <w:trPr>
+          <w:trHeight w:val="92"/>
+        </w:trPr>
+        <w:tc>
+          <w:tcPr>
+            <w:tcW w:w="4675" w:type="dxa"/>
+            <w:vMerge w:val="restart"/>
+            <w:vAlign w:val="center"/>
+          </w:tcPr>
+          <w:p>
+            <w:pPr>
+              <w:jc w:val="center"/>
+            </w:pPr>
+            <w:r>
+              <w:rPr>
+                <w:rFonts w:ascii="Cambria Math" w:hAnsi="Cambria Math" w:cs="Cambria Math"/>
+              </w:rPr>
+              <w:t>∀</w:t>
+            </w:r>
+            <w:r>
+              <w:t>x</w:t>
+            </w:r>
+            <w:r>
+              <w:rPr>
+                <w:rFonts w:ascii="Cambria Math" w:hAnsi="Cambria Math" w:cs="Cambria Math"/>
+              </w:rPr>
+              <w:t>∀</w:t>
+            </w:r>
+            <w:r>
+              <w:t>y</w:t>
+            </w:r>
+            <w:r>
+              <w:rPr>
+                <w:rFonts w:ascii="Cambria Math" w:hAnsi="Cambria Math" w:cs="Cambria Math"/>
+              </w:rPr>
+              <w:t>∃</w:t>
+            </w:r>
+            <w:r>
+              <w:t xml:space="preserve">z(A(x, y) </w:t>
+            </w:r>
+            <w:r>
+              <w:rPr>
+                <w:rFonts w:ascii="Cambria Math" w:hAnsi="Cambria Math" w:cs="Cambria Math"/>
+              </w:rPr>
+              <w:t>∨</w:t>
+            </w:r>
+            <w:r>
+              <w:t xml:space="preserve"> B(z, z) </w:t>
+            </w:r>
+            <w:r>
+              <w:rPr>
+                <w:rFonts w:ascii="Cambria Math" w:hAnsi="Cambria Math" w:cs="Cambria Math"/>
+              </w:rPr>
+              <w:t>∧</w:t>
+            </w:r>
+            <w:r>
+              <w:t xml:space="preserve"> C(x, y, x)</w:t>
+            </w:r>
+          </w:p>
+        </w:tc>
+        <w:tc>
+          <w:tcPr>
+            <w:tcW w:w="4675" w:type="dxa"/>
+            <w:vAlign w:val="center"/>
+          </w:tcPr>
+          <w:p>
+            <w:pPr>
+              <w:jc w:val="center"/>
+            </w:pPr>
+            <w:r>
+              <w:t>U</w:t>
+            </w:r>
+            <w:r>
+              <w:rPr>
+                <w:vertAlign w:val="subscript"/>
+              </w:rPr>
+              <w:t>A</w:t>
+            </w:r>
+            <w:r>
+              <w:t xml:space="preserve"> = </w:t>
+            </w:r>
+            <w:r>
+              <w:t>N</w:t>
+            </w:r>
+            <w:r>
+              <w:t xml:space="preserve"> (natural numbers)</w:t>
+            </w:r>
+          </w:p>
+        </w:tc>
+      </w:tr>
+      <w:tr>
+        <w:trPr>
+          <w:trHeight w:val="92"/>
+        </w:trPr>
+        <w:tc>
+          <w:tcPr>
+            <w:tcW w:w="4675" w:type="dxa"/>
+            <w:vMerge/>
+            <w:vAlign w:val="center"/>
+          </w:tcPr>
+          <w:p>
+            <w:pPr>
+              <w:jc w:val="center"/>
+              <w:rPr>
+                <w:rFonts w:ascii="Cambria Math" w:hAnsi="Cambria Math" w:cs="Cambria Math"/>
+              </w:rPr>
+            </w:pPr>
+          </w:p>
+        </w:tc>
+        <w:tc>
+          <w:tcPr>
+            <w:tcW w:w="4675" w:type="dxa"/>
+            <w:vAlign w:val="center"/>
+          </w:tcPr>
+          <w:p>
+            <w:pPr>
+              <w:jc w:val="center"/>
+            </w:pPr>
+            <w:r>
+              <w:t>A</w:t>
+            </w:r>
+            <w:r>
+              <w:rPr>
+                <w:vertAlign w:val="superscript"/>
+              </w:rPr>
+              <w:t>A</w:t>
+            </w:r>
+            <w:r>
+              <w:t xml:space="preserve"> = {(x, y) | x = y}</w:t>
+            </w:r>
+          </w:p>
+        </w:tc>
+      </w:tr>
+      <w:tr>
+        <w:trPr>
+          <w:trHeight w:val="92"/>
+        </w:trPr>
+        <w:tc>
+          <w:tcPr>
+            <w:tcW w:w="4675" w:type="dxa"/>
+            <w:vMerge/>
+            <w:vAlign w:val="center"/>
+          </w:tcPr>
+          <w:p>
+            <w:pPr>
+              <w:jc w:val="center"/>
+              <w:rPr>
+                <w:rFonts w:ascii="Cambria Math" w:hAnsi="Cambria Math" w:cs="Cambria Math"/>
+              </w:rPr>
+            </w:pPr>
+          </w:p>
+        </w:tc>
+        <w:tc>
+          <w:tcPr>
+            <w:tcW w:w="4675" w:type="dxa"/>
+            <w:vAlign w:val="center"/>
+          </w:tcPr>
+          <w:p>
+            <w:pPr>
+              <w:jc w:val="center"/>
+            </w:pPr>
+            <w:r>
+              <w:t>B</w:t>
+            </w:r>
+            <w:r>
+              <w:rPr>
+                <w:vertAlign w:val="superscript"/>
+              </w:rPr>
+              <w:t>A</w:t>
+            </w:r>
+            <w:r>
+              <w:t xml:space="preserve"> = {(x, y) | </w:t>
+            </w:r>
+            <w:r>
+              <w:t>divides(x, y)</w:t>
+            </w:r>
+            <w:r>
+              <w:t>}</w:t>
+            </w:r>
+          </w:p>
+        </w:tc>
+      </w:tr>
+      <w:tr>
+        <w:trPr>
+          <w:trHeight w:val="92"/>
+        </w:trPr>
+        <w:tc>
+          <w:tcPr>
+            <w:tcW w:w="4675" w:type="dxa"/>
+            <w:vMerge/>
+            <w:vAlign w:val="center"/>
+          </w:tcPr>
+          <w:p>
+            <w:pPr>
+              <w:jc w:val="center"/>
+              <w:rPr>
+                <w:rFonts w:ascii="Cambria Math" w:hAnsi="Cambria Math" w:cs="Cambria Math"/>
+              </w:rPr>
+            </w:pPr>
+          </w:p>
+        </w:tc>
+        <w:tc>
+          <w:tcPr>
+            <w:tcW w:w="4675" w:type="dxa"/>
+            <w:vAlign w:val="center"/>
+          </w:tcPr>
+          <w:p>
+            <w:pPr>
+              <w:jc w:val="center"/>
+            </w:pPr>
+            <w:r>
+              <w:t>C</w:t>
+            </w:r>
+            <w:r>
+              <w:rPr>
+                <w:vertAlign w:val="superscript"/>
+              </w:rPr>
+              <w:t>A</w:t>
+            </w:r>
+            <w:r>
+              <w:t xml:space="preserve"> = {(x, y, z) | x </w:t>
+            </w:r>
+            <w:r>
+              <w:t>&gt;</w:t>
+            </w:r>
+            <w:r>
+              <w:t xml:space="preserve"> y </w:t>
+            </w:r>
+            <w:r>
+              <w:t xml:space="preserve">&gt; </w:t>
+            </w:r>
+            <w:r>
+              <w:t>z}</w:t>
             </w:r>
           </w:p>
         </w:tc>

</xml_diff>

<commit_message>
finished exercise 7 logic
</commit_message>
<xml_diff>
--- a/Fall-2025/logic-for-cs/exercise-set-7.docx
+++ b/Fall-2025/logic-for-cs/exercise-set-7.docx
@@ -332,6 +332,7 @@
                 <w:bCs/>
               </w:rPr>
             </w:pPr>
+            <w:proofErr w:type="spellStart"/>
             <w:r>
               <w:rPr>
                 <w:b/>
@@ -339,6 +340,7 @@
               </w:rPr>
               <w:t>Subformula</w:t>
             </w:r>
+            <w:proofErr w:type="spellEnd"/>
           </w:p>
         </w:tc>
         <w:tc>
@@ -1012,6 +1014,7 @@
               </w:rPr>
               <w:t>∀</w:t>
             </w:r>
+            <w:proofErr w:type="spellStart"/>
             <w:r>
               <w:t>x</w:t>
             </w:r>
@@ -1022,7 +1025,11 @@
               <w:t>∀</w:t>
             </w:r>
             <w:r>
-              <w:t>y(O(x, y) → R(x, y))</w:t>
+              <w:t>y</w:t>
+            </w:r>
+            <w:proofErr w:type="spellEnd"/>
+            <w:r>
+              <w:t>(O(x, y) → R(x, y))</w:t>
             </w:r>
           </w:p>
         </w:tc>
@@ -1244,6 +1251,7 @@
               </w:rPr>
               <w:t>∀</w:t>
             </w:r>
+            <w:proofErr w:type="spellStart"/>
             <w:r>
               <w:t>x</w:t>
             </w:r>
@@ -1254,7 +1262,11 @@
               <w:t>∀</w:t>
             </w:r>
             <w:r>
-              <w:t>y(O(x, y) → R(x, y))</w:t>
+              <w:t>y</w:t>
+            </w:r>
+            <w:proofErr w:type="spellEnd"/>
+            <w:r>
+              <w:t>(O(x, y) → R(x, y))</w:t>
             </w:r>
           </w:p>
         </w:tc>
@@ -1338,6 +1350,7 @@
                 <w:bCs/>
               </w:rPr>
             </w:pPr>
+            <w:proofErr w:type="spellStart"/>
             <w:r>
               <w:rPr>
                 <w:b/>
@@ -1345,6 +1358,7 @@
               </w:rPr>
               <w:t>Subformula</w:t>
             </w:r>
+            <w:proofErr w:type="spellEnd"/>
           </w:p>
         </w:tc>
         <w:tc>
@@ -1394,6 +1408,7 @@
               </w:rPr>
               <w:t>∀</w:t>
             </w:r>
+            <w:proofErr w:type="spellStart"/>
             <w:r>
               <w:t>x</w:t>
             </w:r>
@@ -1404,7 +1419,11 @@
               <w:t>∀</w:t>
             </w:r>
             <w:r>
-              <w:t>y(x + y = y + x)</w:t>
+              <w:t>y</w:t>
+            </w:r>
+            <w:proofErr w:type="spellEnd"/>
+            <w:r>
+              <w:t>(x + y = y + x)</w:t>
             </w:r>
           </w:p>
         </w:tc>
@@ -1533,6 +1552,7 @@
               </w:rPr>
               <w:t>∀</w:t>
             </w:r>
+            <w:proofErr w:type="spellStart"/>
             <w:r>
               <w:t>x</w:t>
             </w:r>
@@ -1543,7 +1563,11 @@
               <w:t>∀</w:t>
             </w:r>
             <w:r>
-              <w:t>y(x + y = y + x)</w:t>
+              <w:t>y</w:t>
+            </w:r>
+            <w:proofErr w:type="spellEnd"/>
+            <w:r>
+              <w:t>(x + y = y + x)</w:t>
             </w:r>
           </w:p>
         </w:tc>
@@ -2617,6 +2641,7 @@
               <w:lastRenderedPageBreak/>
               <w:t>∃</w:t>
             </w:r>
+            <w:proofErr w:type="spellStart"/>
             <w:r>
               <w:t>δ</w:t>
             </w:r>
@@ -2627,7 +2652,11 @@
               <w:t>∃</w:t>
             </w:r>
             <w:r>
-              <w:t>x((2</w:t>
+              <w:t>x</w:t>
+            </w:r>
+            <w:proofErr w:type="spellEnd"/>
+            <w:r>
+              <w:t>((2</w:t>
             </w:r>
             <w:r>
               <w:rPr>
@@ -3236,6 +3265,7 @@
               </w:rPr>
               <w:t>∃</w:t>
             </w:r>
+            <w:proofErr w:type="spellStart"/>
             <w:r>
               <w:t>δ</w:t>
             </w:r>
@@ -3246,7 +3276,11 @@
               <w:t>∃</w:t>
             </w:r>
             <w:r>
-              <w:t>x((2</w:t>
+              <w:t>x</w:t>
+            </w:r>
+            <w:proofErr w:type="spellEnd"/>
+            <w:r>
+              <w:t>((2</w:t>
             </w:r>
             <w:r>
               <w:rPr>
@@ -3313,6 +3347,7 @@
               </w:rPr>
               <w:t>∀</w:t>
             </w:r>
+            <w:proofErr w:type="spellStart"/>
             <w:r>
               <w:t>x</w:t>
             </w:r>
@@ -3332,7 +3367,11 @@
               <w:t>∃</w:t>
             </w:r>
             <w:r>
-              <w:t xml:space="preserve">y(R(ε(x), g(y, z)) → A </w:t>
+              <w:t>y</w:t>
+            </w:r>
+            <w:proofErr w:type="spellEnd"/>
+            <w:r>
+              <w:t xml:space="preserve">(R(ε(x), g(y, z)) → A </w:t>
             </w:r>
             <w:r>
               <w:rPr>
@@ -3350,7 +3389,15 @@
               <w:t>∧</w:t>
             </w:r>
             <w:r>
-              <w:t xml:space="preserve"> R(δ(σ(a, bc)))))</w:t>
+              <w:t xml:space="preserve"> R(δ(σ(a, </w:t>
+            </w:r>
+            <w:proofErr w:type="spellStart"/>
+            <w:r>
+              <w:t>bc</w:t>
+            </w:r>
+            <w:proofErr w:type="spellEnd"/>
+            <w:r>
+              <w:t>)))))</w:t>
             </w:r>
           </w:p>
         </w:tc>
@@ -3513,7 +3560,15 @@
               <w:jc w:val="center"/>
             </w:pPr>
             <w:r>
-              <w:t>R(δ(σ(a, bc)))</w:t>
+              <w:t xml:space="preserve">R(δ(σ(a, </w:t>
+            </w:r>
+            <w:proofErr w:type="spellStart"/>
+            <w:r>
+              <w:t>bc</w:t>
+            </w:r>
+            <w:proofErr w:type="spellEnd"/>
+            <w:r>
+              <w:t>)))</w:t>
             </w:r>
           </w:p>
         </w:tc>
@@ -3642,7 +3697,15 @@
               <w:t>∧</w:t>
             </w:r>
             <w:r>
-              <w:t xml:space="preserve"> R(δ(σ(a, bc)))</w:t>
+              <w:t xml:space="preserve"> R(δ(σ(a, </w:t>
+            </w:r>
+            <w:proofErr w:type="spellStart"/>
+            <w:r>
+              <w:t>bc</w:t>
+            </w:r>
+            <w:proofErr w:type="spellEnd"/>
+            <w:r>
+              <w:t>)))</w:t>
             </w:r>
           </w:p>
         </w:tc>
@@ -3711,7 +3774,15 @@
               <w:t>∧</w:t>
             </w:r>
             <w:r>
-              <w:t xml:space="preserve"> R(δ(σ(a, bc))))</w:t>
+              <w:t xml:space="preserve"> R(δ(σ(a, </w:t>
+            </w:r>
+            <w:proofErr w:type="spellStart"/>
+            <w:r>
+              <w:t>bc</w:t>
+            </w:r>
+            <w:proofErr w:type="spellEnd"/>
+            <w:r>
+              <w:t>))))</w:t>
             </w:r>
           </w:p>
         </w:tc>
@@ -3786,7 +3857,15 @@
               <w:t>∧</w:t>
             </w:r>
             <w:r>
-              <w:t xml:space="preserve"> R(δ(σ(a, bc)))))</w:t>
+              <w:t xml:space="preserve"> R(δ(σ(a, </w:t>
+            </w:r>
+            <w:proofErr w:type="spellStart"/>
+            <w:r>
+              <w:t>bc</w:t>
+            </w:r>
+            <w:proofErr w:type="spellEnd"/>
+            <w:r>
+              <w:t>)))))</w:t>
             </w:r>
           </w:p>
         </w:tc>
@@ -3842,6 +3921,7 @@
               </w:rPr>
               <w:t>∀</w:t>
             </w:r>
+            <w:proofErr w:type="spellStart"/>
             <w:r>
               <w:t>z</w:t>
             </w:r>
@@ -3852,7 +3932,11 @@
               <w:t>∃</w:t>
             </w:r>
             <w:r>
-              <w:t xml:space="preserve">y(R(ε(x), g(y, z)) → A </w:t>
+              <w:t>y</w:t>
+            </w:r>
+            <w:proofErr w:type="spellEnd"/>
+            <w:r>
+              <w:t xml:space="preserve">(R(ε(x), g(y, z)) → A </w:t>
             </w:r>
             <w:r>
               <w:rPr>
@@ -3870,7 +3954,15 @@
               <w:t>∧</w:t>
             </w:r>
             <w:r>
-              <w:t xml:space="preserve"> R(δ(σ(a, bc)))))</w:t>
+              <w:t xml:space="preserve"> R(δ(σ(a, </w:t>
+            </w:r>
+            <w:proofErr w:type="spellStart"/>
+            <w:r>
+              <w:t>bc</w:t>
+            </w:r>
+            <w:proofErr w:type="spellEnd"/>
+            <w:r>
+              <w:t>)))))</w:t>
             </w:r>
           </w:p>
         </w:tc>
@@ -3926,6 +4018,7 @@
               </w:rPr>
               <w:t>∀</w:t>
             </w:r>
+            <w:proofErr w:type="spellStart"/>
             <w:r>
               <w:t>x</w:t>
             </w:r>
@@ -3945,7 +4038,11 @@
               <w:t>∃</w:t>
             </w:r>
             <w:r>
-              <w:t xml:space="preserve">y(R(ε(x), g(y, z)) → A </w:t>
+              <w:t>y</w:t>
+            </w:r>
+            <w:proofErr w:type="spellEnd"/>
+            <w:r>
+              <w:t xml:space="preserve">(R(ε(x), g(y, z)) → A </w:t>
             </w:r>
             <w:r>
               <w:rPr>
@@ -3963,7 +4060,15 @@
               <w:t>∧</w:t>
             </w:r>
             <w:r>
-              <w:t xml:space="preserve"> R(δ(σ(a, bc)))))</w:t>
+              <w:t xml:space="preserve"> R(δ(σ(a, </w:t>
+            </w:r>
+            <w:proofErr w:type="spellStart"/>
+            <w:r>
+              <w:t>bc</w:t>
+            </w:r>
+            <w:proofErr w:type="spellEnd"/>
+            <w:r>
+              <w:t>)))))</w:t>
             </w:r>
           </w:p>
         </w:tc>
@@ -4031,6 +4136,7 @@
               </w:rPr>
               <w:t>∀</w:t>
             </w:r>
+            <w:proofErr w:type="spellStart"/>
             <w:r>
               <w:t>w</w:t>
             </w:r>
@@ -4050,7 +4156,11 @@
               <w:t>∃</w:t>
             </w:r>
             <w:r>
-              <w:t>z(R(w, v, w) → B(z, z))</w:t>
+              <w:t>z</w:t>
+            </w:r>
+            <w:proofErr w:type="spellEnd"/>
+            <w:r>
+              <w:t>(R(w, v, w) → B(z, z))</w:t>
             </w:r>
           </w:p>
         </w:tc>
@@ -4190,6 +4300,7 @@
               </w:rPr>
               <w:t>∀</w:t>
             </w:r>
+            <w:proofErr w:type="spellStart"/>
             <w:r>
               <w:t>x</w:t>
             </w:r>
@@ -4209,7 +4320,11 @@
               <w:t>∃</w:t>
             </w:r>
             <w:r>
-              <w:t xml:space="preserve">z(A(x, y) </w:t>
+              <w:t>z</w:t>
+            </w:r>
+            <w:proofErr w:type="spellEnd"/>
+            <w:r>
+              <w:t xml:space="preserve">(A(x, y) </w:t>
             </w:r>
             <w:r>
               <w:rPr>
@@ -4342,13 +4457,7 @@
               <w:t>A</w:t>
             </w:r>
             <w:r>
-              <w:t xml:space="preserve"> = {(x, y) | </w:t>
-            </w:r>
-            <w:r>
-              <w:t>divides(x, y)</w:t>
-            </w:r>
-            <w:r>
-              <w:t>}</w:t>
+              <w:t xml:space="preserve"> = {(x, y) | divides(x, y)}</w:t>
             </w:r>
           </w:p>
         </w:tc>
@@ -4391,25 +4500,358 @@
               <w:t>A</w:t>
             </w:r>
             <w:r>
-              <w:t xml:space="preserve"> = {(x, y, z) | x </w:t>
-            </w:r>
-            <w:r>
-              <w:t>&gt;</w:t>
-            </w:r>
-            <w:r>
-              <w:t xml:space="preserve"> y </w:t>
-            </w:r>
-            <w:r>
-              <w:t xml:space="preserve">&gt; </w:t>
-            </w:r>
-            <w:r>
-              <w:t>z}</w:t>
+              <w:t xml:space="preserve"> = {(x, y, z) | x &gt; y &gt; z}</w:t>
             </w:r>
           </w:p>
         </w:tc>
       </w:tr>
     </w:tbl>
     <w:p/>
+    <w:p/>
+    <w:p>
+      <w:pPr>
+        <w:rPr>
+          <w:b/>
+          <w:bCs/>
+        </w:rPr>
+      </w:pPr>
+      <w:r>
+        <w:rPr>
+          <w:b/>
+          <w:bCs/>
+        </w:rPr>
+        <w:lastRenderedPageBreak/>
+        <w:t>In addition 1:</w:t>
+      </w:r>
+    </w:p>
+    <w:p>
+      <w:pPr>
+        <w:pStyle w:val="ListParagraph"/>
+        <w:numPr>
+          <w:ilvl w:val="0"/>
+          <w:numId w:val="5"/>
+        </w:numPr>
+      </w:pPr>
+      <w:r>
+        <w:rPr>
+          <w:rFonts w:ascii="Cambria Math" w:hAnsi="Cambria Math" w:cs="Cambria Math"/>
+        </w:rPr>
+        <w:t>∀</w:t>
+      </w:r>
+      <w:proofErr w:type="spellStart"/>
+      <w:r>
+        <w:t>x</w:t>
+      </w:r>
+      <w:r>
+        <w:rPr>
+          <w:rFonts w:ascii="Cambria Math" w:hAnsi="Cambria Math" w:cs="Cambria Math"/>
+        </w:rPr>
+        <w:t>∀</w:t>
+      </w:r>
+      <w:r>
+        <w:t>y</w:t>
+      </w:r>
+      <w:proofErr w:type="spellEnd"/>
+      <w:r>
+        <w:t xml:space="preserve">(x </w:t>
+      </w:r>
+      <w:r>
+        <w:t>×</w:t>
+      </w:r>
+      <w:r>
+        <w:t xml:space="preserve"> y = y </w:t>
+      </w:r>
+      <w:r>
+        <w:t>×</w:t>
+      </w:r>
+      <w:r>
+        <w:t xml:space="preserve"> x)</w:t>
+      </w:r>
+    </w:p>
+    <w:p>
+      <w:pPr>
+        <w:pStyle w:val="ListParagraph"/>
+        <w:numPr>
+          <w:ilvl w:val="0"/>
+          <w:numId w:val="5"/>
+        </w:numPr>
+      </w:pPr>
+      <w:r>
+        <w:rPr>
+          <w:rFonts w:ascii="Cambria Math" w:hAnsi="Cambria Math" w:cs="Cambria Math"/>
+        </w:rPr>
+        <w:t>∀</w:t>
+      </w:r>
+      <w:proofErr w:type="spellStart"/>
+      <w:r>
+        <w:t>x</w:t>
+      </w:r>
+      <w:r>
+        <w:rPr>
+          <w:rFonts w:ascii="Cambria Math" w:hAnsi="Cambria Math" w:cs="Cambria Math"/>
+        </w:rPr>
+        <w:t>∀</w:t>
+      </w:r>
+      <w:r>
+        <w:t>y</w:t>
+      </w:r>
+      <w:r>
+        <w:rPr>
+          <w:rFonts w:ascii="Cambria Math" w:hAnsi="Cambria Math" w:cs="Cambria Math"/>
+        </w:rPr>
+        <w:t>∀</w:t>
+      </w:r>
+      <w:r>
+        <w:t>z</w:t>
+      </w:r>
+      <w:proofErr w:type="spellEnd"/>
+      <w:r>
+        <w:t>(</w:t>
+      </w:r>
+      <w:r>
+        <w:t>(</w:t>
+      </w:r>
+      <w:r>
+        <w:t>x + y</w:t>
+      </w:r>
+      <w:r>
+        <w:t>) + z</w:t>
+      </w:r>
+      <w:r>
+        <w:t xml:space="preserve"> = x</w:t>
+      </w:r>
+      <w:r>
+        <w:t xml:space="preserve"> + (y + z)</w:t>
+      </w:r>
+      <w:r>
+        <w:t>)</w:t>
+      </w:r>
+    </w:p>
+    <w:p>
+      <w:pPr>
+        <w:pStyle w:val="ListParagraph"/>
+        <w:numPr>
+          <w:ilvl w:val="0"/>
+          <w:numId w:val="5"/>
+        </w:numPr>
+      </w:pPr>
+      <w:r>
+        <w:rPr>
+          <w:rFonts w:ascii="Cambria Math" w:hAnsi="Cambria Math" w:cs="Cambria Math"/>
+        </w:rPr>
+        <w:t>∀</w:t>
+      </w:r>
+      <w:proofErr w:type="spellStart"/>
+      <w:r>
+        <w:t>x</w:t>
+      </w:r>
+      <w:r>
+        <w:rPr>
+          <w:rFonts w:ascii="Cambria Math" w:hAnsi="Cambria Math" w:cs="Cambria Math"/>
+        </w:rPr>
+        <w:t>∀</w:t>
+      </w:r>
+      <w:r>
+        <w:t>y</w:t>
+      </w:r>
+      <w:r>
+        <w:rPr>
+          <w:rFonts w:ascii="Cambria Math" w:hAnsi="Cambria Math" w:cs="Cambria Math"/>
+        </w:rPr>
+        <w:t>∀</w:t>
+      </w:r>
+      <w:r>
+        <w:t>z</w:t>
+      </w:r>
+      <w:proofErr w:type="spellEnd"/>
+      <w:r>
+        <w:t>(x ×</w:t>
+      </w:r>
+      <w:r>
+        <w:t xml:space="preserve"> (</w:t>
+      </w:r>
+      <w:r>
+        <w:t>y</w:t>
+      </w:r>
+      <w:r>
+        <w:t xml:space="preserve"> + z</w:t>
+      </w:r>
+      <w:r>
+        <w:t>)</w:t>
+      </w:r>
+      <w:r>
+        <w:t xml:space="preserve"> = </w:t>
+      </w:r>
+      <w:r>
+        <w:t>(</w:t>
+      </w:r>
+      <w:r>
+        <w:t>x</w:t>
+      </w:r>
+      <w:r>
+        <w:t xml:space="preserve"> </w:t>
+      </w:r>
+      <w:r>
+        <w:t>×</w:t>
+      </w:r>
+      <w:r>
+        <w:t xml:space="preserve"> y</w:t>
+      </w:r>
+      <w:r>
+        <w:t>)</w:t>
+      </w:r>
+      <w:r>
+        <w:t xml:space="preserve"> + </w:t>
+      </w:r>
+      <w:r>
+        <w:t xml:space="preserve">(x </w:t>
+      </w:r>
+      <w:r>
+        <w:t>×</w:t>
+      </w:r>
+      <w:r>
+        <w:t xml:space="preserve"> </w:t>
+      </w:r>
+      <w:r>
+        <w:t>z)</w:t>
+      </w:r>
+      <w:r>
+        <w:t>)</w:t>
+      </w:r>
+    </w:p>
+    <w:p>
+      <w:pPr>
+        <w:pStyle w:val="ListParagraph"/>
+        <w:numPr>
+          <w:ilvl w:val="0"/>
+          <w:numId w:val="5"/>
+        </w:numPr>
+      </w:pPr>
+      <w:r>
+        <w:rPr>
+          <w:rFonts w:ascii="Cambria Math" w:hAnsi="Cambria Math" w:cs="Cambria Math"/>
+        </w:rPr>
+        <w:t>∀</w:t>
+      </w:r>
+      <w:r>
+        <w:t xml:space="preserve">e(e &gt; 0 </w:t>
+      </w:r>
+      <w:r>
+        <w:t xml:space="preserve">→ </w:t>
+      </w:r>
+      <w:r>
+        <w:rPr>
+          <w:rFonts w:ascii="Cambria Math" w:hAnsi="Cambria Math" w:cs="Cambria Math"/>
+        </w:rPr>
+        <w:t>∃</w:t>
+      </w:r>
+      <w:proofErr w:type="spellStart"/>
+      <w:r>
+        <w:t>N</w:t>
+      </w:r>
+      <w:r>
+        <w:rPr>
+          <w:rFonts w:ascii="Cambria Math" w:hAnsi="Cambria Math" w:cs="Cambria Math"/>
+        </w:rPr>
+        <w:t>∀</w:t>
+      </w:r>
+      <w:r>
+        <w:rPr>
+          <w:rFonts w:ascii="Cambria Math" w:hAnsi="Cambria Math" w:cs="Cambria Math"/>
+        </w:rPr>
+        <w:t>n</w:t>
+      </w:r>
+      <w:proofErr w:type="spellEnd"/>
+      <w:r>
+        <w:rPr>
+          <w:rFonts w:ascii="Cambria Math" w:hAnsi="Cambria Math" w:cs="Cambria Math"/>
+        </w:rPr>
+        <w:t xml:space="preserve">(n </w:t>
+      </w:r>
+      <w:r>
+        <w:t>≥</w:t>
+      </w:r>
+      <w:r>
+        <w:t xml:space="preserve"> N </w:t>
+      </w:r>
+      <w:r>
+        <w:t>→</w:t>
+      </w:r>
+      <w:r>
+        <w:t xml:space="preserve"> |A(n) – L| &lt; e))</w:t>
+      </w:r>
+    </w:p>
+    <w:p>
+      <w:r>
+        <w:rPr>
+          <w:b/>
+          <w:bCs/>
+        </w:rPr>
+        <w:t>In addition 2:</w:t>
+      </w:r>
+    </w:p>
+    <w:p>
+      <w:pPr>
+        <w:pStyle w:val="ListParagraph"/>
+        <w:numPr>
+          <w:ilvl w:val="0"/>
+          <w:numId w:val="6"/>
+        </w:numPr>
+        <w:rPr>
+          <w:b/>
+          <w:bCs/>
+        </w:rPr>
+      </w:pPr>
+      <w:r>
+        <w:t>U</w:t>
+      </w:r>
+      <w:r>
+        <w:rPr>
+          <w:vertAlign w:val="subscript"/>
+        </w:rPr>
+        <w:t>A</w:t>
+      </w:r>
+      <w:r>
+        <w:t xml:space="preserve"> = </w:t>
+      </w:r>
+      <w:r>
+        <w:t>R</w:t>
+      </w:r>
+      <w:r>
+        <w:t xml:space="preserve"> (</w:t>
+      </w:r>
+      <w:r>
+        <w:t xml:space="preserve">real </w:t>
+      </w:r>
+      <w:r>
+        <w:t>numbers)</w:t>
+      </w:r>
+    </w:p>
+    <w:p>
+      <w:pPr>
+        <w:pStyle w:val="ListParagraph"/>
+        <w:numPr>
+          <w:ilvl w:val="0"/>
+          <w:numId w:val="6"/>
+        </w:numPr>
+        <w:rPr>
+          <w:b/>
+          <w:bCs/>
+        </w:rPr>
+      </w:pPr>
+      <w:r>
+        <w:t>U</w:t>
+      </w:r>
+      <w:r>
+        <w:rPr>
+          <w:vertAlign w:val="subscript"/>
+        </w:rPr>
+        <w:t>A</w:t>
+      </w:r>
+      <w:r>
+        <w:t xml:space="preserve"> = R (real numbers)</w:t>
+      </w:r>
+    </w:p>
     <w:sectPr>
       <w:pgSz w:w="12240" w:h="15840"/>
       <w:pgMar w:top="1440" w:right="1440" w:bottom="1440" w:left="1440" w:header="720" w:footer="720" w:gutter="0"/>
@@ -4601,6 +5043,97 @@
     </w:lvl>
   </w:abstractNum>
   <w:abstractNum w:abstractNumId="2" w15:restartNumberingAfterBreak="0">
+    <w:nsid w:val="356A64EC"/>
+    <w:multiLevelType w:val="hybridMultilevel"/>
+    <w:tmpl w:val="B518D0C0"/>
+    <w:lvl w:ilvl="0" w:tplc="E56847C4">
+      <w:start w:val="1"/>
+      <w:numFmt w:val="decimal"/>
+      <w:lvlText w:val="%1."/>
+      <w:lvlJc w:val="left"/>
+      <w:pPr>
+        <w:ind w:left="720" w:hanging="360"/>
+      </w:pPr>
+      <w:rPr>
+        <w:rFonts w:hint="default"/>
+        <w:b w:val="0"/>
+        <w:bCs w:val="0"/>
+      </w:rPr>
+    </w:lvl>
+    <w:lvl w:ilvl="1" w:tplc="04090019" w:tentative="1">
+      <w:start w:val="1"/>
+      <w:numFmt w:val="lowerLetter"/>
+      <w:lvlText w:val="%2."/>
+      <w:lvlJc w:val="left"/>
+      <w:pPr>
+        <w:ind w:left="1440" w:hanging="360"/>
+      </w:pPr>
+    </w:lvl>
+    <w:lvl w:ilvl="2" w:tplc="0409001B" w:tentative="1">
+      <w:start w:val="1"/>
+      <w:numFmt w:val="lowerRoman"/>
+      <w:lvlText w:val="%3."/>
+      <w:lvlJc w:val="right"/>
+      <w:pPr>
+        <w:ind w:left="2160" w:hanging="180"/>
+      </w:pPr>
+    </w:lvl>
+    <w:lvl w:ilvl="3" w:tplc="0409000F" w:tentative="1">
+      <w:start w:val="1"/>
+      <w:numFmt w:val="decimal"/>
+      <w:lvlText w:val="%4."/>
+      <w:lvlJc w:val="left"/>
+      <w:pPr>
+        <w:ind w:left="2880" w:hanging="360"/>
+      </w:pPr>
+    </w:lvl>
+    <w:lvl w:ilvl="4" w:tplc="04090019" w:tentative="1">
+      <w:start w:val="1"/>
+      <w:numFmt w:val="lowerLetter"/>
+      <w:lvlText w:val="%5."/>
+      <w:lvlJc w:val="left"/>
+      <w:pPr>
+        <w:ind w:left="3600" w:hanging="360"/>
+      </w:pPr>
+    </w:lvl>
+    <w:lvl w:ilvl="5" w:tplc="0409001B" w:tentative="1">
+      <w:start w:val="1"/>
+      <w:numFmt w:val="lowerRoman"/>
+      <w:lvlText w:val="%6."/>
+      <w:lvlJc w:val="right"/>
+      <w:pPr>
+        <w:ind w:left="4320" w:hanging="180"/>
+      </w:pPr>
+    </w:lvl>
+    <w:lvl w:ilvl="6" w:tplc="0409000F" w:tentative="1">
+      <w:start w:val="1"/>
+      <w:numFmt w:val="decimal"/>
+      <w:lvlText w:val="%7."/>
+      <w:lvlJc w:val="left"/>
+      <w:pPr>
+        <w:ind w:left="5040" w:hanging="360"/>
+      </w:pPr>
+    </w:lvl>
+    <w:lvl w:ilvl="7" w:tplc="04090019" w:tentative="1">
+      <w:start w:val="1"/>
+      <w:numFmt w:val="lowerLetter"/>
+      <w:lvlText w:val="%8."/>
+      <w:lvlJc w:val="left"/>
+      <w:pPr>
+        <w:ind w:left="5760" w:hanging="360"/>
+      </w:pPr>
+    </w:lvl>
+    <w:lvl w:ilvl="8" w:tplc="0409001B" w:tentative="1">
+      <w:start w:val="1"/>
+      <w:numFmt w:val="lowerRoman"/>
+      <w:lvlText w:val="%9."/>
+      <w:lvlJc w:val="right"/>
+      <w:pPr>
+        <w:ind w:left="6480" w:hanging="180"/>
+      </w:pPr>
+    </w:lvl>
+  </w:abstractNum>
+  <w:abstractNum w:abstractNumId="3" w15:restartNumberingAfterBreak="0">
     <w:nsid w:val="45F32D10"/>
     <w:multiLevelType w:val="hybridMultilevel"/>
     <w:tmpl w:val="171ABD12"/>
@@ -4689,7 +5222,7 @@
       </w:pPr>
     </w:lvl>
   </w:abstractNum>
-  <w:abstractNum w:abstractNumId="3" w15:restartNumberingAfterBreak="0">
+  <w:abstractNum w:abstractNumId="4" w15:restartNumberingAfterBreak="0">
     <w:nsid w:val="6BD45FBB"/>
     <w:multiLevelType w:val="hybridMultilevel"/>
     <w:tmpl w:val="173E1B8E"/>
@@ -4778,17 +5311,112 @@
       </w:pPr>
     </w:lvl>
   </w:abstractNum>
+  <w:abstractNum w:abstractNumId="5" w15:restartNumberingAfterBreak="0">
+    <w:nsid w:val="71452513"/>
+    <w:multiLevelType w:val="hybridMultilevel"/>
+    <w:tmpl w:val="E090A6D2"/>
+    <w:lvl w:ilvl="0" w:tplc="0409000F">
+      <w:start w:val="1"/>
+      <w:numFmt w:val="decimal"/>
+      <w:lvlText w:val="%1."/>
+      <w:lvlJc w:val="left"/>
+      <w:pPr>
+        <w:ind w:left="720" w:hanging="360"/>
+      </w:pPr>
+      <w:rPr>
+        <w:rFonts w:hint="default"/>
+      </w:rPr>
+    </w:lvl>
+    <w:lvl w:ilvl="1" w:tplc="04090019" w:tentative="1">
+      <w:start w:val="1"/>
+      <w:numFmt w:val="lowerLetter"/>
+      <w:lvlText w:val="%2."/>
+      <w:lvlJc w:val="left"/>
+      <w:pPr>
+        <w:ind w:left="1440" w:hanging="360"/>
+      </w:pPr>
+    </w:lvl>
+    <w:lvl w:ilvl="2" w:tplc="0409001B" w:tentative="1">
+      <w:start w:val="1"/>
+      <w:numFmt w:val="lowerRoman"/>
+      <w:lvlText w:val="%3."/>
+      <w:lvlJc w:val="right"/>
+      <w:pPr>
+        <w:ind w:left="2160" w:hanging="180"/>
+      </w:pPr>
+    </w:lvl>
+    <w:lvl w:ilvl="3" w:tplc="0409000F" w:tentative="1">
+      <w:start w:val="1"/>
+      <w:numFmt w:val="decimal"/>
+      <w:lvlText w:val="%4."/>
+      <w:lvlJc w:val="left"/>
+      <w:pPr>
+        <w:ind w:left="2880" w:hanging="360"/>
+      </w:pPr>
+    </w:lvl>
+    <w:lvl w:ilvl="4" w:tplc="04090019" w:tentative="1">
+      <w:start w:val="1"/>
+      <w:numFmt w:val="lowerLetter"/>
+      <w:lvlText w:val="%5."/>
+      <w:lvlJc w:val="left"/>
+      <w:pPr>
+        <w:ind w:left="3600" w:hanging="360"/>
+      </w:pPr>
+    </w:lvl>
+    <w:lvl w:ilvl="5" w:tplc="0409001B" w:tentative="1">
+      <w:start w:val="1"/>
+      <w:numFmt w:val="lowerRoman"/>
+      <w:lvlText w:val="%6."/>
+      <w:lvlJc w:val="right"/>
+      <w:pPr>
+        <w:ind w:left="4320" w:hanging="180"/>
+      </w:pPr>
+    </w:lvl>
+    <w:lvl w:ilvl="6" w:tplc="0409000F" w:tentative="1">
+      <w:start w:val="1"/>
+      <w:numFmt w:val="decimal"/>
+      <w:lvlText w:val="%7."/>
+      <w:lvlJc w:val="left"/>
+      <w:pPr>
+        <w:ind w:left="5040" w:hanging="360"/>
+      </w:pPr>
+    </w:lvl>
+    <w:lvl w:ilvl="7" w:tplc="04090019" w:tentative="1">
+      <w:start w:val="1"/>
+      <w:numFmt w:val="lowerLetter"/>
+      <w:lvlText w:val="%8."/>
+      <w:lvlJc w:val="left"/>
+      <w:pPr>
+        <w:ind w:left="5760" w:hanging="360"/>
+      </w:pPr>
+    </w:lvl>
+    <w:lvl w:ilvl="8" w:tplc="0409001B" w:tentative="1">
+      <w:start w:val="1"/>
+      <w:numFmt w:val="lowerRoman"/>
+      <w:lvlText w:val="%9."/>
+      <w:lvlJc w:val="right"/>
+      <w:pPr>
+        <w:ind w:left="6480" w:hanging="180"/>
+      </w:pPr>
+    </w:lvl>
+  </w:abstractNum>
   <w:num w:numId="1" w16cid:durableId="2041320468">
     <w:abstractNumId w:val="0"/>
   </w:num>
   <w:num w:numId="2" w16cid:durableId="1036126498">
-    <w:abstractNumId w:val="2"/>
+    <w:abstractNumId w:val="3"/>
   </w:num>
   <w:num w:numId="3" w16cid:durableId="1301035114">
     <w:abstractNumId w:val="1"/>
   </w:num>
   <w:num w:numId="4" w16cid:durableId="356582853">
-    <w:abstractNumId w:val="3"/>
+    <w:abstractNumId w:val="4"/>
+  </w:num>
+  <w:num w:numId="5" w16cid:durableId="223415405">
+    <w:abstractNumId w:val="5"/>
+  </w:num>
+  <w:num w:numId="6" w16cid:durableId="2054308538">
+    <w:abstractNumId w:val="2"/>
   </w:num>
 </w:numbering>
 </file>

</xml_diff>